<commit_message>
correction du document de présentaion de devOps
</commit_message>
<xml_diff>
--- a/video et fichiers à publier/Presentation_DevOps_TaskManager_Microservices_v2.docx
+++ b/video et fichiers à publier/Presentation_DevOps_TaskManager_Microservices_v2.docx
@@ -354,16 +354,20 @@
           <w:rFonts w:ascii="Times New Roman" w:hAnsi="Times New Roman" w:cs="Times New Roman"/>
           <w:sz w:val="24"/>
           <w:szCs w:val="24"/>
-        </w:rPr>
-      </w:pPr>
-      <w:r>
-        <w:rPr>
-          <w:rFonts w:ascii="Times New Roman" w:hAnsi="Times New Roman" w:cs="Times New Roman"/>
-          <w:sz w:val="24"/>
-          <w:szCs w:val="24"/>
+          <w:lang w:val="fr-FR"/>
+        </w:rPr>
+      </w:pPr>
+      <w:proofErr w:type="spellStart"/>
+      <w:r>
+        <w:rPr>
+          <w:rFonts w:ascii="Times New Roman" w:hAnsi="Times New Roman" w:cs="Times New Roman"/>
+          <w:sz w:val="24"/>
+          <w:szCs w:val="24"/>
+          <w:lang w:val="fr-FR"/>
         </w:rPr>
         <w:t>GitHub</w:t>
       </w:r>
+      <w:proofErr w:type="spellEnd"/>
     </w:p>
     <w:p>
       <w:pPr>
@@ -788,43 +792,17 @@
           <w:rFonts w:ascii="Times New Roman" w:hAnsi="Times New Roman" w:cs="Times New Roman"/>
           <w:sz w:val="24"/>
           <w:szCs w:val="24"/>
-        </w:rPr>
-      </w:pPr>
-      <w:proofErr w:type="spellStart"/>
-      <w:r>
-        <w:rPr>
-          <w:rFonts w:ascii="Times New Roman" w:hAnsi="Times New Roman" w:cs="Times New Roman"/>
-          <w:sz w:val="24"/>
-          <w:szCs w:val="24"/>
-        </w:rPr>
-        <w:t>modifie</w:t>
-      </w:r>
-      <w:proofErr w:type="spellEnd"/>
-      <w:r>
-        <w:rPr>
-          <w:rFonts w:ascii="Times New Roman" w:hAnsi="Times New Roman" w:cs="Times New Roman"/>
-          <w:sz w:val="24"/>
-          <w:szCs w:val="24"/>
-        </w:rPr>
-        <w:t xml:space="preserve"> un </w:t>
-      </w:r>
-      <w:proofErr w:type="spellStart"/>
-      <w:r>
-        <w:rPr>
-          <w:rFonts w:ascii="Times New Roman" w:hAnsi="Times New Roman" w:cs="Times New Roman"/>
-          <w:sz w:val="24"/>
-          <w:szCs w:val="24"/>
-        </w:rPr>
-        <w:t>fichier</w:t>
-      </w:r>
-      <w:proofErr w:type="spellEnd"/>
-      <w:r>
-        <w:rPr>
-          <w:rFonts w:ascii="Times New Roman" w:hAnsi="Times New Roman" w:cs="Times New Roman"/>
-          <w:sz w:val="24"/>
-          <w:szCs w:val="24"/>
-        </w:rPr>
-        <w:t xml:space="preserve"> de configuration, </w:t>
+          <w:lang w:val="fr-FR"/>
+        </w:rPr>
+      </w:pPr>
+      <w:r>
+        <w:rPr>
+          <w:rFonts w:ascii="Times New Roman" w:hAnsi="Times New Roman" w:cs="Times New Roman"/>
+          <w:sz w:val="24"/>
+          <w:szCs w:val="24"/>
+          <w:lang w:val="fr-FR"/>
+        </w:rPr>
+        <w:t xml:space="preserve">modifie un fichier de configuration, </w:t>
       </w:r>
     </w:p>
     <w:p>
@@ -975,15 +953,28 @@
           <w:rFonts w:ascii="Times New Roman" w:hAnsi="Times New Roman" w:cs="Times New Roman"/>
           <w:sz w:val="24"/>
           <w:szCs w:val="24"/>
-        </w:rPr>
-      </w:pPr>
-      <w:r>
-        <w:rPr>
-          <w:rFonts w:ascii="Times New Roman" w:hAnsi="Times New Roman" w:cs="Times New Roman"/>
-          <w:sz w:val="24"/>
-          <w:szCs w:val="24"/>
-        </w:rPr>
-        <w:t>GitHub Actions (CI/CD)</w:t>
+          <w:lang w:val="fr-FR"/>
+        </w:rPr>
+      </w:pPr>
+      <w:proofErr w:type="spellStart"/>
+      <w:r>
+        <w:rPr>
+          <w:rFonts w:ascii="Times New Roman" w:hAnsi="Times New Roman" w:cs="Times New Roman"/>
+          <w:sz w:val="24"/>
+          <w:szCs w:val="24"/>
+          <w:lang w:val="fr-FR"/>
+        </w:rPr>
+        <w:t>GitHub</w:t>
+      </w:r>
+      <w:proofErr w:type="spellEnd"/>
+      <w:r>
+        <w:rPr>
+          <w:rFonts w:ascii="Times New Roman" w:hAnsi="Times New Roman" w:cs="Times New Roman"/>
+          <w:sz w:val="24"/>
+          <w:szCs w:val="24"/>
+          <w:lang w:val="fr-FR"/>
+        </w:rPr>
+        <w:t xml:space="preserve"> Actions (CI/CD)</w:t>
       </w:r>
     </w:p>
     <w:p>
@@ -1110,6 +1101,7 @@
           <w:rFonts w:ascii="Times New Roman" w:hAnsi="Times New Roman" w:cs="Times New Roman"/>
           <w:sz w:val="24"/>
           <w:szCs w:val="24"/>
+          <w:lang w:val="fr-FR"/>
         </w:rPr>
       </w:pPr>
     </w:p>
@@ -1120,18 +1112,18 @@
           <w:rFonts w:ascii="Times New Roman" w:hAnsi="Times New Roman" w:cs="Times New Roman"/>
           <w:sz w:val="24"/>
           <w:szCs w:val="24"/>
-        </w:rPr>
-      </w:pPr>
-      <w:proofErr w:type="spellStart"/>
-      <w:r>
-        <w:rPr>
-          <w:rFonts w:ascii="Times New Roman" w:hAnsi="Times New Roman" w:cs="Times New Roman"/>
-          <w:sz w:val="24"/>
-          <w:szCs w:val="24"/>
+          <w:lang w:val="fr-FR"/>
+        </w:rPr>
+      </w:pPr>
+      <w:r>
+        <w:rPr>
+          <w:rFonts w:ascii="Times New Roman" w:hAnsi="Times New Roman" w:cs="Times New Roman"/>
+          <w:sz w:val="24"/>
+          <w:szCs w:val="24"/>
+          <w:lang w:val="fr-FR"/>
         </w:rPr>
         <w:t>Rôle</w:t>
       </w:r>
-      <w:proofErr w:type="spellEnd"/>
     </w:p>
     <w:p>
       <w:pPr>
@@ -1392,70 +1384,27 @@
           <w:rFonts w:ascii="Times New Roman" w:hAnsi="Times New Roman" w:cs="Times New Roman"/>
           <w:sz w:val="24"/>
           <w:szCs w:val="24"/>
-        </w:rPr>
-      </w:pPr>
-      <w:r>
-        <w:rPr>
-          <w:rFonts w:ascii="Times New Roman" w:hAnsi="Times New Roman" w:cs="Times New Roman"/>
-          <w:sz w:val="24"/>
-          <w:szCs w:val="24"/>
-        </w:rPr>
-        <w:t xml:space="preserve">Il </w:t>
-      </w:r>
-      <w:proofErr w:type="spellStart"/>
-      <w:r>
-        <w:rPr>
-          <w:rFonts w:ascii="Times New Roman" w:hAnsi="Times New Roman" w:cs="Times New Roman"/>
-          <w:sz w:val="24"/>
-          <w:szCs w:val="24"/>
-        </w:rPr>
-        <w:t>faut</w:t>
-      </w:r>
-      <w:proofErr w:type="spellEnd"/>
-      <w:r>
-        <w:rPr>
-          <w:rFonts w:ascii="Times New Roman" w:hAnsi="Times New Roman" w:cs="Times New Roman"/>
-          <w:sz w:val="24"/>
-          <w:szCs w:val="24"/>
-        </w:rPr>
-        <w:t xml:space="preserve"> </w:t>
-      </w:r>
-      <w:proofErr w:type="spellStart"/>
-      <w:r>
-        <w:rPr>
-          <w:rFonts w:ascii="Times New Roman" w:hAnsi="Times New Roman" w:cs="Times New Roman"/>
-          <w:sz w:val="24"/>
-          <w:szCs w:val="24"/>
-        </w:rPr>
-        <w:t>préciser</w:t>
-      </w:r>
-      <w:proofErr w:type="spellEnd"/>
-      <w:r>
-        <w:rPr>
-          <w:rFonts w:ascii="Times New Roman" w:hAnsi="Times New Roman" w:cs="Times New Roman"/>
-          <w:sz w:val="24"/>
-          <w:szCs w:val="24"/>
-        </w:rPr>
-        <w:t xml:space="preserve"> </w:t>
-      </w:r>
-      <w:proofErr w:type="gramStart"/>
-      <w:r>
-        <w:rPr>
-          <w:rFonts w:ascii="Times New Roman" w:hAnsi="Times New Roman" w:cs="Times New Roman"/>
-          <w:sz w:val="24"/>
-          <w:szCs w:val="24"/>
-        </w:rPr>
-        <w:t>que</w:t>
-      </w:r>
-      <w:r>
-        <w:rPr>
-          <w:rFonts w:ascii="Times New Roman" w:hAnsi="Times New Roman" w:cs="Times New Roman"/>
-          <w:sz w:val="24"/>
-          <w:szCs w:val="24"/>
+          <w:lang w:val="fr-FR"/>
+        </w:rPr>
+      </w:pPr>
+      <w:r>
+        <w:rPr>
+          <w:rFonts w:ascii="Times New Roman" w:hAnsi="Times New Roman" w:cs="Times New Roman"/>
+          <w:sz w:val="24"/>
+          <w:szCs w:val="24"/>
+          <w:lang w:val="fr-FR"/>
+        </w:rPr>
+        <w:t>Il faut préciser que</w:t>
+      </w:r>
+      <w:r>
+        <w:rPr>
+          <w:rFonts w:ascii="Times New Roman" w:hAnsi="Times New Roman" w:cs="Times New Roman"/>
+          <w:sz w:val="24"/>
+          <w:szCs w:val="24"/>
+          <w:lang w:val="fr-FR"/>
         </w:rPr>
         <w:t xml:space="preserve"> :</w:t>
       </w:r>
-      <w:proofErr w:type="gramEnd"/>
     </w:p>
     <w:p>
       <w:pPr>
@@ -2135,26 +2084,18 @@
           <w:rFonts w:ascii="Times New Roman" w:hAnsi="Times New Roman" w:cs="Times New Roman"/>
           <w:sz w:val="24"/>
           <w:szCs w:val="24"/>
-        </w:rPr>
-      </w:pPr>
-      <w:r>
-        <w:rPr>
-          <w:rFonts w:ascii="Times New Roman" w:hAnsi="Times New Roman" w:cs="Times New Roman"/>
-          <w:sz w:val="24"/>
-          <w:szCs w:val="24"/>
-        </w:rPr>
-        <w:t xml:space="preserve">Son </w:t>
-      </w:r>
-      <w:proofErr w:type="spellStart"/>
-      <w:r>
-        <w:rPr>
-          <w:rFonts w:ascii="Times New Roman" w:hAnsi="Times New Roman" w:cs="Times New Roman"/>
-          <w:sz w:val="24"/>
-          <w:szCs w:val="24"/>
-        </w:rPr>
-        <w:t>rôle</w:t>
-      </w:r>
-      <w:proofErr w:type="spellEnd"/>
+          <w:lang w:val="fr-FR"/>
+        </w:rPr>
+      </w:pPr>
+      <w:r>
+        <w:rPr>
+          <w:rFonts w:ascii="Times New Roman" w:hAnsi="Times New Roman" w:cs="Times New Roman"/>
+          <w:sz w:val="24"/>
+          <w:szCs w:val="24"/>
+          <w:lang w:val="fr-FR"/>
+        </w:rPr>
+        <w:t>Son rôle</w:t>
+      </w:r>
     </w:p>
     <w:p>
       <w:pPr>
@@ -2270,97 +2211,17 @@
           <w:rFonts w:ascii="Times New Roman" w:hAnsi="Times New Roman" w:cs="Times New Roman"/>
           <w:sz w:val="24"/>
           <w:szCs w:val="24"/>
-        </w:rPr>
-      </w:pPr>
-      <w:proofErr w:type="spellStart"/>
-      <w:r>
-        <w:rPr>
-          <w:rFonts w:ascii="Times New Roman" w:hAnsi="Times New Roman" w:cs="Times New Roman"/>
-          <w:sz w:val="24"/>
-          <w:szCs w:val="24"/>
-        </w:rPr>
-        <w:t>redémarrer</w:t>
-      </w:r>
-      <w:proofErr w:type="spellEnd"/>
-      <w:r>
-        <w:rPr>
-          <w:rFonts w:ascii="Times New Roman" w:hAnsi="Times New Roman" w:cs="Times New Roman"/>
-          <w:sz w:val="24"/>
-          <w:szCs w:val="24"/>
-        </w:rPr>
-        <w:t xml:space="preserve"> </w:t>
-      </w:r>
-      <w:proofErr w:type="spellStart"/>
-      <w:r>
-        <w:rPr>
-          <w:rFonts w:ascii="Times New Roman" w:hAnsi="Times New Roman" w:cs="Times New Roman"/>
-          <w:sz w:val="24"/>
-          <w:szCs w:val="24"/>
-        </w:rPr>
-        <w:t>automatiquement</w:t>
-      </w:r>
-      <w:proofErr w:type="spellEnd"/>
-      <w:r>
-        <w:rPr>
-          <w:rFonts w:ascii="Times New Roman" w:hAnsi="Times New Roman" w:cs="Times New Roman"/>
-          <w:sz w:val="24"/>
-          <w:szCs w:val="24"/>
-        </w:rPr>
-        <w:t xml:space="preserve"> un service </w:t>
-      </w:r>
-      <w:proofErr w:type="spellStart"/>
-      <w:r>
-        <w:rPr>
-          <w:rFonts w:ascii="Times New Roman" w:hAnsi="Times New Roman" w:cs="Times New Roman"/>
-          <w:sz w:val="24"/>
-          <w:szCs w:val="24"/>
-        </w:rPr>
-        <w:t>en</w:t>
-      </w:r>
-      <w:proofErr w:type="spellEnd"/>
-      <w:r>
-        <w:rPr>
-          <w:rFonts w:ascii="Times New Roman" w:hAnsi="Times New Roman" w:cs="Times New Roman"/>
-          <w:sz w:val="24"/>
-          <w:szCs w:val="24"/>
-        </w:rPr>
-        <w:t xml:space="preserve"> </w:t>
-      </w:r>
-      <w:proofErr w:type="spellStart"/>
-      <w:r>
-        <w:rPr>
-          <w:rFonts w:ascii="Times New Roman" w:hAnsi="Times New Roman" w:cs="Times New Roman"/>
-          <w:sz w:val="24"/>
-          <w:szCs w:val="24"/>
-        </w:rPr>
-        <w:t>cas</w:t>
-      </w:r>
-      <w:proofErr w:type="spellEnd"/>
-      <w:r>
-        <w:rPr>
-          <w:rFonts w:ascii="Times New Roman" w:hAnsi="Times New Roman" w:cs="Times New Roman"/>
-          <w:sz w:val="24"/>
-          <w:szCs w:val="24"/>
-        </w:rPr>
-        <w:t xml:space="preserve"> de </w:t>
-      </w:r>
-      <w:proofErr w:type="spellStart"/>
-      <w:r>
-        <w:rPr>
-          <w:rFonts w:ascii="Times New Roman" w:hAnsi="Times New Roman" w:cs="Times New Roman"/>
-          <w:sz w:val="24"/>
-          <w:szCs w:val="24"/>
-        </w:rPr>
-        <w:t>panne</w:t>
-      </w:r>
-      <w:proofErr w:type="spellEnd"/>
-      <w:r>
-        <w:rPr>
-          <w:rFonts w:ascii="Times New Roman" w:hAnsi="Times New Roman" w:cs="Times New Roman"/>
-          <w:sz w:val="24"/>
-          <w:szCs w:val="24"/>
-        </w:rPr>
-        <w:t xml:space="preserve">, </w:t>
+          <w:lang w:val="fr-FR"/>
+        </w:rPr>
+      </w:pPr>
+      <w:r>
+        <w:rPr>
+          <w:rFonts w:ascii="Times New Roman" w:hAnsi="Times New Roman" w:cs="Times New Roman"/>
+          <w:sz w:val="24"/>
+          <w:szCs w:val="24"/>
+          <w:lang w:val="fr-FR"/>
+        </w:rPr>
+        <w:t xml:space="preserve">redémarrer automatiquement un service en cas de panne, </w:t>
       </w:r>
     </w:p>
     <w:p>
@@ -2406,27 +2267,17 @@
           <w:rFonts w:ascii="Times New Roman" w:hAnsi="Times New Roman" w:cs="Times New Roman"/>
           <w:sz w:val="24"/>
           <w:szCs w:val="24"/>
-        </w:rPr>
-      </w:pPr>
-      <w:proofErr w:type="spellStart"/>
-      <w:proofErr w:type="gramStart"/>
-      <w:r>
-        <w:rPr>
-          <w:rFonts w:ascii="Times New Roman" w:hAnsi="Times New Roman" w:cs="Times New Roman"/>
-          <w:sz w:val="24"/>
-          <w:szCs w:val="24"/>
-        </w:rPr>
-        <w:t>mettre</w:t>
-      </w:r>
-      <w:proofErr w:type="spellEnd"/>
-      <w:proofErr w:type="gramEnd"/>
-      <w:r>
-        <w:rPr>
-          <w:rFonts w:ascii="Times New Roman" w:hAnsi="Times New Roman" w:cs="Times New Roman"/>
-          <w:sz w:val="24"/>
-          <w:szCs w:val="24"/>
-        </w:rPr>
-        <w:t xml:space="preserve"> à jour les applications sans interruption.</w:t>
+          <w:lang w:val="fr-FR"/>
+        </w:rPr>
+      </w:pPr>
+      <w:r>
+        <w:rPr>
+          <w:rFonts w:ascii="Times New Roman" w:hAnsi="Times New Roman" w:cs="Times New Roman"/>
+          <w:sz w:val="24"/>
+          <w:szCs w:val="24"/>
+          <w:lang w:val="fr-FR"/>
+        </w:rPr>
+        <w:t>mettre à jour les applications sans interruption.</w:t>
       </w:r>
     </w:p>
     <w:p>
@@ -2802,16 +2653,58 @@
           <w:rFonts w:ascii="Times New Roman" w:hAnsi="Times New Roman" w:cs="Times New Roman"/>
           <w:sz w:val="24"/>
           <w:szCs w:val="24"/>
-        </w:rPr>
-      </w:pPr>
-      <w:r>
-        <w:rPr>
-          <w:rFonts w:ascii="Times New Roman" w:hAnsi="Times New Roman" w:cs="Times New Roman"/>
-          <w:sz w:val="24"/>
-          <w:szCs w:val="24"/>
+          <w:lang w:val="fr-FR"/>
+        </w:rPr>
+      </w:pPr>
+      <w:r>
+        <w:rPr>
+          <w:rFonts w:ascii="Times New Roman" w:hAnsi="Times New Roman" w:cs="Times New Roman"/>
+          <w:sz w:val="24"/>
+          <w:szCs w:val="24"/>
+          <w:lang w:val="fr-FR"/>
         </w:rPr>
         <w:lastRenderedPageBreak/>
-        <w:t>Workflow CI (Continuous Integration)</w:t>
+        <w:t>Workflow CI (</w:t>
+      </w:r>
+      <w:proofErr w:type="spellStart"/>
+      <w:r>
+        <w:rPr>
+          <w:rFonts w:ascii="Times New Roman" w:hAnsi="Times New Roman" w:cs="Times New Roman"/>
+          <w:sz w:val="24"/>
+          <w:szCs w:val="24"/>
+          <w:lang w:val="fr-FR"/>
+        </w:rPr>
+        <w:t>Continuous</w:t>
+      </w:r>
+      <w:proofErr w:type="spellEnd"/>
+      <w:r>
+        <w:rPr>
+          <w:rFonts w:ascii="Times New Roman" w:hAnsi="Times New Roman" w:cs="Times New Roman"/>
+          <w:sz w:val="24"/>
+          <w:szCs w:val="24"/>
+          <w:lang w:val="fr-FR"/>
+        </w:rPr>
+        <w:t xml:space="preserve"> </w:t>
+      </w:r>
+      <w:proofErr w:type="spellStart"/>
+      <w:r>
+        <w:rPr>
+          <w:rFonts w:ascii="Times New Roman" w:hAnsi="Times New Roman" w:cs="Times New Roman"/>
+          <w:sz w:val="24"/>
+          <w:szCs w:val="24"/>
+          <w:lang w:val="fr-FR"/>
+        </w:rPr>
+        <w:t>Integration</w:t>
+      </w:r>
+      <w:proofErr w:type="spellEnd"/>
+      <w:r>
+        <w:rPr>
+          <w:rFonts w:ascii="Times New Roman" w:hAnsi="Times New Roman" w:cs="Times New Roman"/>
+          <w:sz w:val="24"/>
+          <w:szCs w:val="24"/>
+          <w:lang w:val="fr-FR"/>
+        </w:rPr>
+        <w:t>)</w:t>
       </w:r>
     </w:p>
     <w:p>
@@ -2821,18 +2714,18 @@
           <w:rFonts w:ascii="Times New Roman" w:hAnsi="Times New Roman" w:cs="Times New Roman"/>
           <w:sz w:val="24"/>
           <w:szCs w:val="24"/>
-        </w:rPr>
-      </w:pPr>
-      <w:proofErr w:type="spellStart"/>
-      <w:r>
-        <w:rPr>
-          <w:rFonts w:ascii="Times New Roman" w:hAnsi="Times New Roman" w:cs="Times New Roman"/>
-          <w:sz w:val="24"/>
-          <w:szCs w:val="24"/>
+          <w:lang w:val="fr-FR"/>
+        </w:rPr>
+      </w:pPr>
+      <w:r>
+        <w:rPr>
+          <w:rFonts w:ascii="Times New Roman" w:hAnsi="Times New Roman" w:cs="Times New Roman"/>
+          <w:sz w:val="24"/>
+          <w:szCs w:val="24"/>
+          <w:lang w:val="fr-FR"/>
         </w:rPr>
         <w:t>Objectif</w:t>
       </w:r>
-      <w:proofErr w:type="spellEnd"/>
     </w:p>
     <w:p>
       <w:pPr>
@@ -3200,18 +3093,18 @@
           <w:rFonts w:ascii="Times New Roman" w:hAnsi="Times New Roman" w:cs="Times New Roman"/>
           <w:sz w:val="24"/>
           <w:szCs w:val="24"/>
-        </w:rPr>
-      </w:pPr>
-      <w:proofErr w:type="spellStart"/>
-      <w:r>
-        <w:rPr>
-          <w:rFonts w:ascii="Times New Roman" w:hAnsi="Times New Roman" w:cs="Times New Roman"/>
-          <w:sz w:val="24"/>
-          <w:szCs w:val="24"/>
+          <w:lang w:val="fr-FR"/>
+        </w:rPr>
+      </w:pPr>
+      <w:r>
+        <w:rPr>
+          <w:rFonts w:ascii="Times New Roman" w:hAnsi="Times New Roman" w:cs="Times New Roman"/>
+          <w:sz w:val="24"/>
+          <w:szCs w:val="24"/>
+          <w:lang w:val="fr-FR"/>
         </w:rPr>
         <w:t>Objectif</w:t>
       </w:r>
-      <w:proofErr w:type="spellEnd"/>
     </w:p>
     <w:p>
       <w:pPr>
@@ -3255,6 +3148,7 @@
           <w:rFonts w:ascii="Times New Roman" w:eastAsiaTheme="majorEastAsia" w:hAnsi="Times New Roman" w:cs="Times New Roman"/>
           <w:sz w:val="22"/>
           <w:szCs w:val="22"/>
+          <w:lang w:val="en-GB"/>
         </w:rPr>
       </w:pPr>
       <w:r>
@@ -3263,6 +3157,7 @@
           <w:rFonts w:ascii="Times New Roman" w:eastAsiaTheme="majorEastAsia" w:hAnsi="Times New Roman" w:cs="Times New Roman"/>
           <w:sz w:val="22"/>
           <w:szCs w:val="22"/>
+          <w:lang w:val="en-GB"/>
         </w:rPr>
         <w:t>Commit</w:t>
       </w:r>
@@ -3275,6 +3170,7 @@
           <w:rFonts w:ascii="Times New Roman" w:eastAsiaTheme="majorEastAsia" w:hAnsi="Times New Roman" w:cs="Times New Roman"/>
           <w:sz w:val="22"/>
           <w:szCs w:val="22"/>
+          <w:lang w:val="en-GB"/>
         </w:rPr>
       </w:pPr>
       <w:r>
@@ -3283,6 +3179,7 @@
           <w:rFonts w:ascii="Times New Roman" w:eastAsiaTheme="majorEastAsia" w:hAnsi="Times New Roman" w:cs="Times New Roman"/>
           <w:sz w:val="22"/>
           <w:szCs w:val="22"/>
+          <w:lang w:val="en-GB"/>
         </w:rPr>
         <w:t xml:space="preserve"> ↓</w:t>
       </w:r>
@@ -3295,19 +3192,19 @@
           <w:rFonts w:ascii="Times New Roman" w:eastAsiaTheme="majorEastAsia" w:hAnsi="Times New Roman" w:cs="Times New Roman"/>
           <w:sz w:val="22"/>
           <w:szCs w:val="22"/>
-        </w:rPr>
-      </w:pPr>
-      <w:proofErr w:type="spellStart"/>
+          <w:lang w:val="en-GB"/>
+        </w:rPr>
+      </w:pPr>
       <w:r>
         <w:rPr>
           <w:rStyle w:val="CodeHTML"/>
           <w:rFonts w:ascii="Times New Roman" w:eastAsiaTheme="majorEastAsia" w:hAnsi="Times New Roman" w:cs="Times New Roman"/>
           <w:sz w:val="22"/>
           <w:szCs w:val="22"/>
+          <w:lang w:val="en-GB"/>
         </w:rPr>
         <w:t>Build</w:t>
       </w:r>
-      <w:proofErr w:type="spellEnd"/>
     </w:p>
     <w:p>
       <w:pPr>
@@ -3317,6 +3214,7 @@
           <w:rFonts w:ascii="Times New Roman" w:eastAsiaTheme="majorEastAsia" w:hAnsi="Times New Roman" w:cs="Times New Roman"/>
           <w:sz w:val="22"/>
           <w:szCs w:val="22"/>
+          <w:lang w:val="en-GB"/>
         </w:rPr>
       </w:pPr>
       <w:r>
@@ -3325,6 +3223,7 @@
           <w:rFonts w:ascii="Times New Roman" w:eastAsiaTheme="majorEastAsia" w:hAnsi="Times New Roman" w:cs="Times New Roman"/>
           <w:sz w:val="22"/>
           <w:szCs w:val="22"/>
+          <w:lang w:val="en-GB"/>
         </w:rPr>
         <w:t xml:space="preserve"> ↓</w:t>
       </w:r>
@@ -3337,6 +3236,7 @@
           <w:rFonts w:ascii="Times New Roman" w:eastAsiaTheme="majorEastAsia" w:hAnsi="Times New Roman" w:cs="Times New Roman"/>
           <w:sz w:val="22"/>
           <w:szCs w:val="22"/>
+          <w:lang w:val="en-GB"/>
         </w:rPr>
       </w:pPr>
       <w:r>
@@ -3345,6 +3245,7 @@
           <w:rFonts w:ascii="Times New Roman" w:eastAsiaTheme="majorEastAsia" w:hAnsi="Times New Roman" w:cs="Times New Roman"/>
           <w:sz w:val="22"/>
           <w:szCs w:val="22"/>
+          <w:lang w:val="en-GB"/>
         </w:rPr>
         <w:t>Test</w:t>
       </w:r>
@@ -3357,6 +3258,7 @@
           <w:rFonts w:ascii="Times New Roman" w:eastAsiaTheme="majorEastAsia" w:hAnsi="Times New Roman" w:cs="Times New Roman"/>
           <w:sz w:val="22"/>
           <w:szCs w:val="22"/>
+          <w:lang w:val="en-GB"/>
         </w:rPr>
       </w:pPr>
       <w:r>
@@ -3365,6 +3267,7 @@
           <w:rFonts w:ascii="Times New Roman" w:eastAsiaTheme="majorEastAsia" w:hAnsi="Times New Roman" w:cs="Times New Roman"/>
           <w:sz w:val="22"/>
           <w:szCs w:val="22"/>
+          <w:lang w:val="en-GB"/>
         </w:rPr>
         <w:t xml:space="preserve"> ↓</w:t>
       </w:r>
@@ -3377,6 +3280,7 @@
           <w:rFonts w:ascii="Times New Roman" w:eastAsiaTheme="majorEastAsia" w:hAnsi="Times New Roman" w:cs="Times New Roman"/>
           <w:sz w:val="22"/>
           <w:szCs w:val="22"/>
+          <w:lang w:val="en-GB"/>
         </w:rPr>
       </w:pPr>
       <w:r>
@@ -3385,6 +3289,7 @@
           <w:rFonts w:ascii="Times New Roman" w:eastAsiaTheme="majorEastAsia" w:hAnsi="Times New Roman" w:cs="Times New Roman"/>
           <w:sz w:val="22"/>
           <w:szCs w:val="22"/>
+          <w:lang w:val="en-GB"/>
         </w:rPr>
         <w:t>Docker</w:t>
       </w:r>
@@ -3397,6 +3302,7 @@
           <w:rFonts w:ascii="Times New Roman" w:eastAsiaTheme="majorEastAsia" w:hAnsi="Times New Roman" w:cs="Times New Roman"/>
           <w:sz w:val="22"/>
           <w:szCs w:val="22"/>
+          <w:lang w:val="en-GB"/>
         </w:rPr>
       </w:pPr>
       <w:r>
@@ -3405,6 +3311,7 @@
           <w:rFonts w:ascii="Times New Roman" w:eastAsiaTheme="majorEastAsia" w:hAnsi="Times New Roman" w:cs="Times New Roman"/>
           <w:sz w:val="22"/>
           <w:szCs w:val="22"/>
+          <w:lang w:val="en-GB"/>
         </w:rPr>
         <w:t xml:space="preserve"> ↓</w:t>
       </w:r>
@@ -3417,6 +3324,7 @@
           <w:rFonts w:ascii="Times New Roman" w:eastAsiaTheme="majorEastAsia" w:hAnsi="Times New Roman" w:cs="Times New Roman"/>
           <w:sz w:val="22"/>
           <w:szCs w:val="22"/>
+          <w:lang w:val="en-GB"/>
         </w:rPr>
       </w:pPr>
       <w:r>
@@ -3425,6 +3333,7 @@
           <w:rFonts w:ascii="Times New Roman" w:eastAsiaTheme="majorEastAsia" w:hAnsi="Times New Roman" w:cs="Times New Roman"/>
           <w:sz w:val="22"/>
           <w:szCs w:val="22"/>
+          <w:lang w:val="en-GB"/>
         </w:rPr>
         <w:t>Push</w:t>
       </w:r>
@@ -3437,6 +3346,7 @@
           <w:rFonts w:ascii="Times New Roman" w:eastAsiaTheme="majorEastAsia" w:hAnsi="Times New Roman" w:cs="Times New Roman"/>
           <w:sz w:val="22"/>
           <w:szCs w:val="22"/>
+          <w:lang w:val="en-GB"/>
         </w:rPr>
       </w:pPr>
       <w:r>
@@ -3445,6 +3355,7 @@
           <w:rFonts w:ascii="Times New Roman" w:eastAsiaTheme="majorEastAsia" w:hAnsi="Times New Roman" w:cs="Times New Roman"/>
           <w:sz w:val="22"/>
           <w:szCs w:val="22"/>
+          <w:lang w:val="en-GB"/>
         </w:rPr>
         <w:t xml:space="preserve"> ↓</w:t>
       </w:r>
@@ -3519,18 +3430,18 @@
           <w:rFonts w:ascii="Times New Roman" w:hAnsi="Times New Roman" w:cs="Times New Roman"/>
           <w:sz w:val="24"/>
           <w:szCs w:val="24"/>
-        </w:rPr>
-      </w:pPr>
-      <w:proofErr w:type="spellStart"/>
-      <w:r>
-        <w:rPr>
-          <w:rFonts w:ascii="Times New Roman" w:hAnsi="Times New Roman" w:cs="Times New Roman"/>
-          <w:sz w:val="24"/>
-          <w:szCs w:val="24"/>
+          <w:lang w:val="fr-FR"/>
+        </w:rPr>
+      </w:pPr>
+      <w:r>
+        <w:rPr>
+          <w:rFonts w:ascii="Times New Roman" w:hAnsi="Times New Roman" w:cs="Times New Roman"/>
+          <w:sz w:val="24"/>
+          <w:szCs w:val="24"/>
+          <w:lang w:val="fr-FR"/>
         </w:rPr>
         <w:t>Déroulement</w:t>
       </w:r>
-      <w:proofErr w:type="spellEnd"/>
     </w:p>
     <w:p>
       <w:pPr>
@@ -4192,12 +4103,21 @@
     <w:p>
       <w:pPr>
         <w:pStyle w:val="Titre2"/>
-      </w:pPr>
-      <w:r>
+        <w:rPr>
+          <w:lang w:val="fr-FR"/>
+        </w:rPr>
+      </w:pPr>
+      <w:r>
+        <w:rPr>
+          <w:lang w:val="fr-FR"/>
+        </w:rPr>
         <w:t xml:space="preserve">• </w:t>
       </w:r>
       <w:proofErr w:type="spellStart"/>
       <w:r>
+        <w:rPr>
+          <w:lang w:val="fr-FR"/>
+        </w:rPr>
         <w:t>Dockerfile</w:t>
       </w:r>
       <w:proofErr w:type="spellEnd"/>
@@ -4224,12 +4144,21 @@
     <w:p>
       <w:pPr>
         <w:pStyle w:val="Titre2"/>
-      </w:pPr>
-      <w:r>
+        <w:rPr>
+          <w:lang w:val="fr-FR"/>
+        </w:rPr>
+      </w:pPr>
+      <w:r>
+        <w:rPr>
+          <w:lang w:val="fr-FR"/>
+        </w:rPr>
         <w:t>• k8s/*.</w:t>
       </w:r>
       <w:proofErr w:type="spellStart"/>
       <w:r>
+        <w:rPr>
+          <w:lang w:val="fr-FR"/>
+        </w:rPr>
         <w:t>yml</w:t>
       </w:r>
       <w:proofErr w:type="spellEnd"/>
@@ -4337,28 +4266,49 @@
     <w:p>
       <w:pPr>
         <w:pStyle w:val="Titre2"/>
-      </w:pPr>
-      <w:r>
+        <w:rPr>
+          <w:lang w:val="fr-FR"/>
+        </w:rPr>
+      </w:pPr>
+      <w:r>
+        <w:rPr>
+          <w:lang w:val="fr-FR"/>
+        </w:rPr>
         <w:lastRenderedPageBreak/>
         <w:t>•</w:t>
       </w:r>
       <w:r>
+        <w:rPr>
+          <w:lang w:val="fr-FR"/>
+        </w:rPr>
         <w:t xml:space="preserve"> </w:t>
       </w:r>
       <w:proofErr w:type="spellStart"/>
       <w:r>
+        <w:rPr>
+          <w:lang w:val="fr-FR"/>
+        </w:rPr>
         <w:t>ci.yml</w:t>
       </w:r>
       <w:proofErr w:type="spellEnd"/>
       <w:r>
+        <w:rPr>
+          <w:lang w:val="fr-FR"/>
+        </w:rPr>
         <w:t xml:space="preserve"> / </w:t>
       </w:r>
       <w:proofErr w:type="spellStart"/>
       <w:r>
+        <w:rPr>
+          <w:lang w:val="fr-FR"/>
+        </w:rPr>
         <w:t>cd.yml</w:t>
       </w:r>
       <w:proofErr w:type="spellEnd"/>
       <w:r>
+        <w:rPr>
+          <w:lang w:val="fr-FR"/>
+        </w:rPr>
         <w:t xml:space="preserve"> </w:t>
       </w:r>
     </w:p>
@@ -4434,8 +4384,14 @@
     <w:p>
       <w:pPr>
         <w:pStyle w:val="Titre2"/>
-      </w:pPr>
-      <w:r>
+        <w:rPr>
+          <w:lang w:val="fr-FR"/>
+        </w:rPr>
+      </w:pPr>
+      <w:r>
+        <w:rPr>
+          <w:lang w:val="fr-FR"/>
+        </w:rPr>
         <w:t>• devops_files.py</w:t>
       </w:r>
     </w:p>
@@ -4483,8 +4439,14 @@
     <w:p>
       <w:pPr>
         <w:pStyle w:val="Titre2"/>
-      </w:pPr>
-      <w:r>
+        <w:rPr>
+          <w:lang w:val="fr-FR"/>
+        </w:rPr>
+      </w:pPr>
+      <w:r>
+        <w:rPr>
+          <w:lang w:val="fr-FR"/>
+        </w:rPr>
         <w:t>• devops_ci.py</w:t>
       </w:r>
     </w:p>
@@ -4516,12 +4478,21 @@
     <w:p>
       <w:pPr>
         <w:pStyle w:val="Titre2"/>
-      </w:pPr>
-      <w:r>
+        <w:rPr>
+          <w:lang w:val="fr-FR"/>
+        </w:rPr>
+      </w:pPr>
+      <w:r>
+        <w:rPr>
+          <w:lang w:val="fr-FR"/>
+        </w:rPr>
         <w:t>• .</w:t>
       </w:r>
       <w:proofErr w:type="spellStart"/>
       <w:r>
+        <w:rPr>
+          <w:lang w:val="fr-FR"/>
+        </w:rPr>
         <w:t>env</w:t>
       </w:r>
       <w:proofErr w:type="spellEnd"/>
@@ -4554,20 +4525,21 @@
     <w:p>
       <w:pPr>
         <w:pStyle w:val="Titre2"/>
-      </w:pPr>
-      <w:r>
-        <w:t xml:space="preserve">• </w:t>
-      </w:r>
-      <w:proofErr w:type="gramStart"/>
-      <w:r>
-        <w:t>application-</w:t>
-      </w:r>
-      <w:proofErr w:type="gramEnd"/>
-      <w:r>
-        <w:t>*.</w:t>
+        <w:rPr>
+          <w:lang w:val="fr-FR"/>
+        </w:rPr>
+      </w:pPr>
+      <w:r>
+        <w:rPr>
+          <w:lang w:val="fr-FR"/>
+        </w:rPr>
+        <w:t>• application-*.</w:t>
       </w:r>
       <w:proofErr w:type="spellStart"/>
       <w:r>
+        <w:rPr>
+          <w:lang w:val="fr-FR"/>
+        </w:rPr>
         <w:t>yml</w:t>
       </w:r>
       <w:proofErr w:type="spellEnd"/>
@@ -4636,28 +4608,22 @@
           <w:numId w:val="17"/>
         </w:numPr>
         <w:spacing w:before="100" w:beforeAutospacing="1" w:after="100" w:afterAutospacing="1" w:line="240" w:lineRule="auto"/>
-      </w:pPr>
-      <w:proofErr w:type="gramStart"/>
+        <w:rPr>
+          <w:lang w:val="fr-FR"/>
+        </w:rPr>
+      </w:pPr>
       <w:r>
         <w:rPr>
           <w:rStyle w:val="lev"/>
+          <w:lang w:val="fr-FR"/>
         </w:rPr>
         <w:t>Docker</w:t>
       </w:r>
       <w:r>
-        <w:t xml:space="preserve"> assure</w:t>
-      </w:r>
-      <w:proofErr w:type="gramEnd"/>
-      <w:r>
-        <w:t xml:space="preserve"> la </w:t>
-      </w:r>
-      <w:proofErr w:type="spellStart"/>
-      <w:r>
-        <w:t>conteneurisation</w:t>
-      </w:r>
-      <w:proofErr w:type="spellEnd"/>
-      <w:r>
-        <w:t xml:space="preserve"> des applications. </w:t>
+        <w:rPr>
+          <w:lang w:val="fr-FR"/>
+        </w:rPr>
+        <w:t xml:space="preserve"> assure la conteneurisation des applications. </w:t>
       </w:r>
     </w:p>
     <w:p>
@@ -4667,39 +4633,24 @@
           <w:numId w:val="17"/>
         </w:numPr>
         <w:spacing w:before="100" w:beforeAutospacing="1" w:after="100" w:afterAutospacing="1" w:line="240" w:lineRule="auto"/>
-      </w:pPr>
+        <w:rPr>
+          <w:lang w:val="fr-FR"/>
+        </w:rPr>
+      </w:pPr>
+      <w:proofErr w:type="spellStart"/>
       <w:r>
         <w:rPr>
           <w:rStyle w:val="lev"/>
+          <w:lang w:val="fr-FR"/>
         </w:rPr>
         <w:t>Kubernetes</w:t>
       </w:r>
-      <w:r>
-        <w:t xml:space="preserve"> </w:t>
-      </w:r>
-      <w:proofErr w:type="spellStart"/>
-      <w:r>
-        <w:t>orchestre</w:t>
-      </w:r>
       <w:proofErr w:type="spellEnd"/>
       <w:r>
-        <w:t xml:space="preserve"> les </w:t>
-      </w:r>
-      <w:proofErr w:type="spellStart"/>
-      <w:r>
-        <w:t>conteneurs</w:t>
-      </w:r>
-      <w:proofErr w:type="spellEnd"/>
-      <w:r>
-        <w:t xml:space="preserve"> </w:t>
-      </w:r>
-      <w:proofErr w:type="spellStart"/>
-      <w:r>
-        <w:t>en</w:t>
-      </w:r>
-      <w:proofErr w:type="spellEnd"/>
-      <w:r>
-        <w:t xml:space="preserve"> production. </w:t>
+        <w:rPr>
+          <w:lang w:val="fr-FR"/>
+        </w:rPr>
+        <w:t xml:space="preserve"> orchestre les conteneurs en production. </w:t>
       </w:r>
     </w:p>
     <w:p>
@@ -4709,39 +4660,45 @@
           <w:numId w:val="17"/>
         </w:numPr>
         <w:spacing w:before="100" w:beforeAutospacing="1" w:after="100" w:afterAutospacing="1" w:line="240" w:lineRule="auto"/>
-      </w:pPr>
+        <w:rPr>
+          <w:lang w:val="fr-FR"/>
+        </w:rPr>
+      </w:pPr>
+      <w:proofErr w:type="spellStart"/>
       <w:r>
         <w:rPr>
           <w:rStyle w:val="lev"/>
-        </w:rPr>
-        <w:t>GitHub Actions</w:t>
-      </w:r>
-      <w:r>
-        <w:t xml:space="preserve"> </w:t>
+          <w:lang w:val="fr-FR"/>
+        </w:rPr>
+        <w:t>GitHub</w:t>
+      </w:r>
+      <w:proofErr w:type="spellEnd"/>
+      <w:r>
+        <w:rPr>
+          <w:rStyle w:val="lev"/>
+          <w:lang w:val="fr-FR"/>
+        </w:rPr>
+        <w:t xml:space="preserve"> Actions</w:t>
+      </w:r>
+      <w:r>
+        <w:rPr>
+          <w:lang w:val="fr-FR"/>
+        </w:rPr>
+        <w:t xml:space="preserve"> automatise les phases de </w:t>
       </w:r>
       <w:proofErr w:type="spellStart"/>
       <w:r>
-        <w:t>automatise</w:t>
+        <w:rPr>
+          <w:lang w:val="fr-FR"/>
+        </w:rPr>
+        <w:t>build</w:t>
       </w:r>
       <w:proofErr w:type="spellEnd"/>
       <w:r>
-        <w:t xml:space="preserve"> les phases de build, de test </w:t>
-      </w:r>
-      <w:proofErr w:type="gramStart"/>
-      <w:r>
-        <w:t>et</w:t>
-      </w:r>
-      <w:proofErr w:type="gramEnd"/>
-      <w:r>
-        <w:t xml:space="preserve"> de </w:t>
-      </w:r>
-      <w:proofErr w:type="spellStart"/>
-      <w:r>
-        <w:t>déploiement</w:t>
-      </w:r>
-      <w:proofErr w:type="spellEnd"/>
-      <w:r>
-        <w:t xml:space="preserve">. </w:t>
+        <w:rPr>
+          <w:lang w:val="fr-FR"/>
+        </w:rPr>
+        <w:t xml:space="preserve">, de test et de déploiement. </w:t>
       </w:r>
     </w:p>
     <w:p>
@@ -4751,42 +4708,28 @@
           <w:numId w:val="17"/>
         </w:numPr>
         <w:spacing w:before="100" w:beforeAutospacing="1" w:after="100" w:afterAutospacing="1" w:line="240" w:lineRule="auto"/>
-      </w:pPr>
-      <w:r>
+        <w:rPr>
+          <w:lang w:val="fr-FR"/>
+        </w:rPr>
+      </w:pPr>
+      <w:r>
+        <w:rPr>
+          <w:lang w:val="fr-FR"/>
+        </w:rPr>
         <w:t xml:space="preserve">Les </w:t>
       </w:r>
       <w:r>
         <w:rPr>
           <w:rStyle w:val="lev"/>
+          <w:lang w:val="fr-FR"/>
         </w:rPr>
         <w:t>scripts Python</w:t>
       </w:r>
       <w:r>
-        <w:t xml:space="preserve"> </w:t>
-      </w:r>
-      <w:proofErr w:type="spellStart"/>
-      <w:r>
-        <w:t>facilitent</w:t>
-      </w:r>
-      <w:proofErr w:type="spellEnd"/>
-      <w:r>
-        <w:t xml:space="preserve"> les </w:t>
-      </w:r>
-      <w:proofErr w:type="spellStart"/>
-      <w:r>
-        <w:t>tâches</w:t>
-      </w:r>
-      <w:proofErr w:type="spellEnd"/>
-      <w:r>
-        <w:t xml:space="preserve"> </w:t>
-      </w:r>
-      <w:proofErr w:type="spellStart"/>
-      <w:r>
-        <w:t>répétitives</w:t>
-      </w:r>
-      <w:proofErr w:type="spellEnd"/>
-      <w:r>
-        <w:t xml:space="preserve">. </w:t>
+        <w:rPr>
+          <w:lang w:val="fr-FR"/>
+        </w:rPr>
+        <w:t xml:space="preserve"> facilitent les tâches répétitives. </w:t>
       </w:r>
     </w:p>
     <w:p>
@@ -4796,83 +4739,59 @@
           <w:numId w:val="17"/>
         </w:numPr>
         <w:spacing w:before="100" w:beforeAutospacing="1" w:after="100" w:afterAutospacing="1" w:line="240" w:lineRule="auto"/>
-      </w:pPr>
-      <w:r>
-        <w:t xml:space="preserve">Les </w:t>
+        <w:rPr>
+          <w:lang w:val="fr-FR"/>
+        </w:rPr>
+      </w:pPr>
+      <w:r>
+        <w:rPr>
+          <w:lang w:val="fr-FR"/>
+        </w:rPr>
+        <w:t xml:space="preserve">Les fichiers </w:t>
+      </w:r>
+      <w:r>
+        <w:rPr>
+          <w:rStyle w:val="lev"/>
+          <w:lang w:val="fr-FR"/>
+        </w:rPr>
+        <w:t>.</w:t>
       </w:r>
       <w:proofErr w:type="spellStart"/>
       <w:r>
-        <w:t>fichiers</w:t>
+        <w:rPr>
+          <w:rStyle w:val="lev"/>
+          <w:lang w:val="fr-FR"/>
+        </w:rPr>
+        <w:t>env</w:t>
       </w:r>
       <w:proofErr w:type="spellEnd"/>
       <w:r>
-        <w:t xml:space="preserve"> </w:t>
+        <w:rPr>
+          <w:lang w:val="fr-FR"/>
+        </w:rPr>
+        <w:t xml:space="preserve"> et </w:t>
       </w:r>
       <w:r>
         <w:rPr>
           <w:rStyle w:val="lev"/>
-        </w:rPr>
-        <w:t>.</w:t>
+          <w:lang w:val="fr-FR"/>
+        </w:rPr>
+        <w:t>application-*.</w:t>
       </w:r>
       <w:proofErr w:type="spellStart"/>
       <w:r>
         <w:rPr>
           <w:rStyle w:val="lev"/>
-        </w:rPr>
-        <w:t>env</w:t>
+          <w:lang w:val="fr-FR"/>
+        </w:rPr>
+        <w:t>yml</w:t>
       </w:r>
       <w:proofErr w:type="spellEnd"/>
       <w:r>
-        <w:t xml:space="preserve"> </w:t>
-      </w:r>
-      <w:proofErr w:type="gramStart"/>
-      <w:r>
-        <w:t>et</w:t>
-      </w:r>
-      <w:proofErr w:type="gramEnd"/>
-      <w:r>
-        <w:t xml:space="preserve"> </w:t>
-      </w:r>
-      <w:r>
-        <w:rPr>
-          <w:rStyle w:val="lev"/>
-        </w:rPr>
-        <w:t>application-*.</w:t>
-      </w:r>
-      <w:proofErr w:type="spellStart"/>
-      <w:r>
-        <w:rPr>
-          <w:rStyle w:val="lev"/>
-        </w:rPr>
-        <w:t>yml</w:t>
-      </w:r>
-      <w:proofErr w:type="spellEnd"/>
-      <w:r>
-        <w:t xml:space="preserve"> </w:t>
-      </w:r>
-      <w:proofErr w:type="spellStart"/>
-      <w:r>
-        <w:t>centralisent</w:t>
-      </w:r>
-      <w:proofErr w:type="spellEnd"/>
-      <w:r>
-        <w:t xml:space="preserve"> </w:t>
-      </w:r>
-      <w:proofErr w:type="spellStart"/>
-      <w:r>
-        <w:t>toute</w:t>
-      </w:r>
-      <w:proofErr w:type="spellEnd"/>
-      <w:r>
-        <w:t xml:space="preserve"> la configuration de </w:t>
-      </w:r>
-      <w:proofErr w:type="spellStart"/>
-      <w:r>
-        <w:t>l'application</w:t>
-      </w:r>
-      <w:proofErr w:type="spellEnd"/>
-      <w:r>
-        <w:t>.</w:t>
+        <w:rPr>
+          <w:lang w:val="fr-FR"/>
+        </w:rPr>
+        <w:t xml:space="preserve"> centralisent toute la configuration de l'application.</w:t>
       </w:r>
     </w:p>
     <w:p>
@@ -4882,13 +4801,15 @@
           <w:rFonts w:ascii="Times New Roman" w:hAnsi="Times New Roman" w:cs="Times New Roman"/>
           <w:sz w:val="24"/>
           <w:szCs w:val="24"/>
-        </w:rPr>
-      </w:pPr>
-      <w:r>
-        <w:rPr>
-          <w:rFonts w:ascii="Times New Roman" w:hAnsi="Times New Roman" w:cs="Times New Roman"/>
-          <w:sz w:val="24"/>
-          <w:szCs w:val="24"/>
+          <w:lang w:val="fr-FR"/>
+        </w:rPr>
+      </w:pPr>
+      <w:r>
+        <w:rPr>
+          <w:rFonts w:ascii="Times New Roman" w:hAnsi="Times New Roman" w:cs="Times New Roman"/>
+          <w:sz w:val="24"/>
+          <w:szCs w:val="24"/>
+          <w:lang w:val="fr-FR"/>
         </w:rPr>
         <w:t>10. Conclusion</w:t>
       </w:r>
@@ -4981,6 +4902,102 @@
           <w:lang w:val="fr-FR"/>
         </w:rPr>
         <w:t>//////// //</w:t>
+      </w:r>
+    </w:p>
+    <w:p>
+      <w:pPr>
+        <w:spacing w:after="0"/>
+        <w:rPr>
+          <w:rFonts w:ascii="Times New Roman" w:hAnsi="Times New Roman" w:cs="Times New Roman"/>
+          <w:sz w:val="24"/>
+          <w:szCs w:val="24"/>
+          <w:lang w:val="fr-FR"/>
+        </w:rPr>
+      </w:pPr>
+      <w:r>
+        <w:rPr>
+          <w:lang w:val="fr-FR"/>
+        </w:rPr>
+        <w:t>Arrêter et</w:t>
+      </w:r>
+      <w:r>
+        <w:rPr>
+          <w:rFonts w:ascii="Times New Roman" w:hAnsi="Times New Roman" w:cs="Times New Roman"/>
+          <w:sz w:val="24"/>
+          <w:szCs w:val="24"/>
+          <w:lang w:val="fr-FR"/>
+        </w:rPr>
+        <w:t xml:space="preserve"> s</w:t>
+      </w:r>
+      <w:r>
+        <w:rPr>
+          <w:rFonts w:ascii="Times New Roman" w:hAnsi="Times New Roman" w:cs="Times New Roman"/>
+          <w:sz w:val="24"/>
+          <w:szCs w:val="24"/>
+          <w:lang w:val="fr-FR"/>
+        </w:rPr>
+        <w:t xml:space="preserve">upprimer les </w:t>
+      </w:r>
+      <w:r>
+        <w:rPr>
+          <w:rFonts w:ascii="Times New Roman" w:hAnsi="Times New Roman" w:cs="Times New Roman"/>
+          <w:sz w:val="24"/>
+          <w:szCs w:val="24"/>
+          <w:lang w:val="fr-FR"/>
+        </w:rPr>
+        <w:t>contene</w:t>
+      </w:r>
+      <w:r>
+        <w:rPr>
+          <w:rFonts w:ascii="Times New Roman" w:hAnsi="Times New Roman" w:cs="Times New Roman"/>
+          <w:sz w:val="24"/>
+          <w:szCs w:val="24"/>
+          <w:lang w:val="fr-FR"/>
+        </w:rPr>
+        <w:t xml:space="preserve">urs et </w:t>
+      </w:r>
+      <w:r>
+        <w:rPr>
+          <w:rFonts w:ascii="Times New Roman" w:hAnsi="Times New Roman" w:cs="Times New Roman"/>
+          <w:sz w:val="24"/>
+          <w:szCs w:val="24"/>
+          <w:lang w:val="fr-FR"/>
+        </w:rPr>
+        <w:t>volumes :</w:t>
+      </w:r>
+    </w:p>
+    <w:p>
+      <w:pPr>
+        <w:spacing w:after="0"/>
+        <w:rPr>
+          <w:rFonts w:ascii="Times New Roman" w:hAnsi="Times New Roman" w:cs="Times New Roman"/>
+          <w:color w:val="0070C0"/>
+          <w:sz w:val="24"/>
+          <w:szCs w:val="24"/>
+          <w:lang w:val="fr-FR"/>
+        </w:rPr>
+      </w:pPr>
+      <w:proofErr w:type="gramStart"/>
+      <w:r>
+        <w:rPr>
+          <w:rFonts w:ascii="Times New Roman" w:hAnsi="Times New Roman" w:cs="Times New Roman"/>
+          <w:color w:val="0070C0"/>
+          <w:sz w:val="24"/>
+          <w:szCs w:val="24"/>
+          <w:lang w:val="fr-FR"/>
+        </w:rPr>
+        <w:t>docker</w:t>
+      </w:r>
+      <w:proofErr w:type="gramEnd"/>
+      <w:r>
+        <w:rPr>
+          <w:rFonts w:ascii="Times New Roman" w:hAnsi="Times New Roman" w:cs="Times New Roman"/>
+          <w:color w:val="0070C0"/>
+          <w:sz w:val="24"/>
+          <w:szCs w:val="24"/>
+          <w:lang w:val="fr-FR"/>
+        </w:rPr>
+        <w:t xml:space="preserve"> compose down -v</w:t>
       </w:r>
     </w:p>
     <w:p>
@@ -5011,49 +5028,80 @@
         <w:spacing w:after="0" w:line="240" w:lineRule="auto"/>
         <w:rPr>
           <w:rFonts w:ascii="Times New Roman" w:hAnsi="Times New Roman" w:cs="Times New Roman"/>
-          <w:sz w:val="24"/>
-          <w:szCs w:val="24"/>
-          <w:lang w:val="fr-FR"/>
-        </w:rPr>
-      </w:pPr>
+          <w:color w:val="0070C0"/>
+          <w:sz w:val="24"/>
+          <w:szCs w:val="24"/>
+          <w:lang w:val="en-GB"/>
+        </w:rPr>
+      </w:pPr>
+      <w:proofErr w:type="spellStart"/>
       <w:proofErr w:type="gramStart"/>
       <w:r>
         <w:rPr>
           <w:rFonts w:ascii="Times New Roman" w:hAnsi="Times New Roman" w:cs="Times New Roman"/>
-          <w:sz w:val="24"/>
-          <w:szCs w:val="24"/>
-          <w:lang w:val="fr-FR"/>
+          <w:color w:val="0070C0"/>
+          <w:sz w:val="24"/>
+          <w:szCs w:val="24"/>
+          <w:lang w:val="en-GB"/>
         </w:rPr>
         <w:t>docker</w:t>
       </w:r>
+      <w:proofErr w:type="spellEnd"/>
       <w:proofErr w:type="gramEnd"/>
       <w:r>
         <w:rPr>
           <w:rFonts w:ascii="Times New Roman" w:hAnsi="Times New Roman" w:cs="Times New Roman"/>
-          <w:sz w:val="24"/>
-          <w:szCs w:val="24"/>
-          <w:lang w:val="fr-FR"/>
-        </w:rPr>
-        <w:t xml:space="preserve"> compose</w:t>
-      </w:r>
-      <w:r>
-        <w:rPr>
-          <w:rFonts w:ascii="Times New Roman" w:hAnsi="Times New Roman" w:cs="Times New Roman"/>
-          <w:sz w:val="24"/>
-          <w:szCs w:val="24"/>
-          <w:lang w:val="fr-FR"/>
+          <w:color w:val="0070C0"/>
+          <w:sz w:val="24"/>
+          <w:szCs w:val="24"/>
+          <w:lang w:val="en-GB"/>
+        </w:rPr>
+        <w:t xml:space="preserve"> compose build</w:t>
+      </w:r>
+    </w:p>
+    <w:p>
+      <w:pPr>
+        <w:spacing w:after="0"/>
+        <w:rPr>
+          <w:rStyle w:val="l"/>
+          <w:rFonts w:ascii="Times New Roman" w:hAnsi="Times New Roman" w:cs="Times New Roman"/>
+          <w:color w:val="0070C0"/>
+          <w:sz w:val="24"/>
+          <w:szCs w:val="24"/>
+        </w:rPr>
+      </w:pPr>
+      <w:proofErr w:type="spellStart"/>
+      <w:proofErr w:type="gramStart"/>
+      <w:r>
+        <w:rPr>
+          <w:rFonts w:ascii="Times New Roman" w:hAnsi="Times New Roman" w:cs="Times New Roman"/>
+          <w:color w:val="0070C0"/>
+          <w:sz w:val="24"/>
+          <w:szCs w:val="24"/>
+        </w:rPr>
+        <w:t>docker</w:t>
+      </w:r>
+      <w:proofErr w:type="spellEnd"/>
+      <w:proofErr w:type="gramEnd"/>
+      <w:r>
+        <w:rPr>
+          <w:rFonts w:ascii="Times New Roman" w:hAnsi="Times New Roman" w:cs="Times New Roman"/>
+          <w:color w:val="0070C0"/>
+          <w:sz w:val="24"/>
+          <w:szCs w:val="24"/>
         </w:rPr>
         <w:t xml:space="preserve"> </w:t>
       </w:r>
       <w:proofErr w:type="spellStart"/>
       <w:r>
         <w:rPr>
-          <w:rFonts w:ascii="Times New Roman" w:hAnsi="Times New Roman" w:cs="Times New Roman"/>
-          <w:sz w:val="24"/>
-          <w:szCs w:val="24"/>
-          <w:lang w:val="fr-FR"/>
-        </w:rPr>
-        <w:t>build</w:t>
+          <w:rStyle w:val="l"/>
+          <w:rFonts w:ascii="Times New Roman" w:hAnsi="Times New Roman" w:cs="Times New Roman"/>
+          <w:color w:val="0070C0"/>
+          <w:sz w:val="24"/>
+          <w:szCs w:val="24"/>
+        </w:rPr>
+        <w:t>ps</w:t>
       </w:r>
       <w:proofErr w:type="spellEnd"/>
     </w:p>
@@ -5063,6 +5111,7 @@
         <w:rPr>
           <w:rStyle w:val="l"/>
           <w:rFonts w:ascii="Times New Roman" w:hAnsi="Times New Roman" w:cs="Times New Roman"/>
+          <w:color w:val="0070C0"/>
           <w:sz w:val="24"/>
           <w:szCs w:val="24"/>
         </w:rPr>
@@ -5072,6 +5121,7 @@
       <w:r>
         <w:rPr>
           <w:rFonts w:ascii="Times New Roman" w:hAnsi="Times New Roman" w:cs="Times New Roman"/>
+          <w:color w:val="0070C0"/>
           <w:sz w:val="24"/>
           <w:szCs w:val="24"/>
         </w:rPr>
@@ -5082,756 +5132,314 @@
       <w:r>
         <w:rPr>
           <w:rFonts w:ascii="Times New Roman" w:hAnsi="Times New Roman" w:cs="Times New Roman"/>
-          <w:sz w:val="24"/>
-          <w:szCs w:val="24"/>
-        </w:rPr>
-        <w:t xml:space="preserve"> </w:t>
-      </w:r>
-      <w:proofErr w:type="spellStart"/>
+          <w:color w:val="0070C0"/>
+          <w:sz w:val="24"/>
+          <w:szCs w:val="24"/>
+        </w:rPr>
+        <w:t xml:space="preserve"> compose </w:t>
+      </w:r>
       <w:r>
         <w:rPr>
           <w:rStyle w:val="l"/>
           <w:rFonts w:ascii="Times New Roman" w:hAnsi="Times New Roman" w:cs="Times New Roman"/>
-          <w:sz w:val="24"/>
-          <w:szCs w:val="24"/>
-        </w:rPr>
-        <w:t>ps</w:t>
-      </w:r>
-      <w:proofErr w:type="spellEnd"/>
+          <w:color w:val="0070C0"/>
+          <w:sz w:val="24"/>
+          <w:szCs w:val="24"/>
+        </w:rPr>
+        <w:t>image</w:t>
+      </w:r>
     </w:p>
     <w:p>
       <w:pPr>
-        <w:spacing w:after="0"/>
-        <w:rPr>
-          <w:rStyle w:val="l"/>
-          <w:rFonts w:ascii="Times New Roman" w:hAnsi="Times New Roman" w:cs="Times New Roman"/>
-          <w:sz w:val="24"/>
-          <w:szCs w:val="24"/>
-        </w:rPr>
-      </w:pPr>
-      <w:proofErr w:type="spellStart"/>
-      <w:proofErr w:type="gramStart"/>
-      <w:r>
-        <w:rPr>
-          <w:rFonts w:ascii="Times New Roman" w:hAnsi="Times New Roman" w:cs="Times New Roman"/>
-          <w:sz w:val="24"/>
-          <w:szCs w:val="24"/>
-        </w:rPr>
-        <w:t>docker</w:t>
-      </w:r>
-      <w:proofErr w:type="spellEnd"/>
-      <w:proofErr w:type="gramEnd"/>
-      <w:r>
-        <w:rPr>
-          <w:rFonts w:ascii="Times New Roman" w:hAnsi="Times New Roman" w:cs="Times New Roman"/>
-          <w:sz w:val="24"/>
-          <w:szCs w:val="24"/>
-        </w:rPr>
-        <w:t xml:space="preserve"> compose </w:t>
-      </w:r>
-      <w:r>
-        <w:rPr>
-          <w:rStyle w:val="l"/>
-          <w:rFonts w:ascii="Times New Roman" w:hAnsi="Times New Roman" w:cs="Times New Roman"/>
-          <w:sz w:val="24"/>
-          <w:szCs w:val="24"/>
-        </w:rPr>
-        <w:t>image</w:t>
-      </w:r>
-    </w:p>
-    <w:p>
-      <w:pPr>
-        <w:spacing w:after="0"/>
-        <w:rPr>
-          <w:rStyle w:val="l"/>
-          <w:rFonts w:ascii="Times New Roman" w:hAnsi="Times New Roman" w:cs="Times New Roman"/>
-          <w:sz w:val="24"/>
-          <w:szCs w:val="24"/>
-        </w:rPr>
-      </w:pPr>
-      <w:r>
-        <w:rPr>
-          <w:rStyle w:val="l"/>
-          <w:rFonts w:ascii="Times New Roman" w:hAnsi="Times New Roman" w:cs="Times New Roman"/>
-          <w:sz w:val="24"/>
-          <w:szCs w:val="24"/>
-        </w:rPr>
-        <w:t>//</w:t>
-      </w:r>
-    </w:p>
-    <w:p>
-      <w:pPr>
-        <w:spacing w:after="0"/>
-        <w:rPr>
-          <w:rFonts w:ascii="Times New Roman" w:hAnsi="Times New Roman" w:cs="Times New Roman"/>
-          <w:sz w:val="24"/>
-          <w:szCs w:val="24"/>
-          <w:lang w:val="fr-FR"/>
-        </w:rPr>
-      </w:pPr>
-      <w:r>
-        <w:rPr>
-          <w:rFonts w:ascii="Times New Roman" w:hAnsi="Times New Roman" w:cs="Times New Roman"/>
-          <w:sz w:val="24"/>
-          <w:szCs w:val="24"/>
-          <w:lang w:val="fr-FR"/>
-        </w:rPr>
-        <w:t xml:space="preserve">Lancer les conteneurs, après le </w:t>
-      </w:r>
-      <w:proofErr w:type="spellStart"/>
-      <w:r>
-        <w:rPr>
-          <w:rFonts w:ascii="Times New Roman" w:hAnsi="Times New Roman" w:cs="Times New Roman"/>
-          <w:sz w:val="24"/>
-          <w:szCs w:val="24"/>
-          <w:lang w:val="fr-FR"/>
-        </w:rPr>
-        <w:t>build</w:t>
-      </w:r>
-      <w:proofErr w:type="spellEnd"/>
-      <w:r>
-        <w:rPr>
-          <w:rFonts w:ascii="Times New Roman" w:hAnsi="Times New Roman" w:cs="Times New Roman"/>
-          <w:sz w:val="24"/>
-          <w:szCs w:val="24"/>
-          <w:lang w:val="fr-FR"/>
-        </w:rPr>
-        <w:t>, il faut exécuter :</w:t>
-      </w:r>
-    </w:p>
-    <w:p>
-      <w:pPr>
-        <w:spacing w:after="0"/>
-        <w:rPr>
-          <w:rFonts w:ascii="Times New Roman" w:hAnsi="Times New Roman" w:cs="Times New Roman"/>
-          <w:sz w:val="24"/>
-          <w:szCs w:val="24"/>
-          <w:lang w:val="fr-FR"/>
-        </w:rPr>
-      </w:pPr>
-    </w:p>
-    <w:p>
-      <w:pPr>
-        <w:spacing w:after="0"/>
-        <w:rPr>
-          <w:rFonts w:ascii="Times New Roman" w:hAnsi="Times New Roman" w:cs="Times New Roman"/>
-          <w:sz w:val="24"/>
-          <w:szCs w:val="24"/>
-          <w:lang w:val="fr-FR"/>
-        </w:rPr>
-      </w:pPr>
-      <w:proofErr w:type="gramStart"/>
-      <w:r>
-        <w:rPr>
-          <w:rFonts w:ascii="Times New Roman" w:hAnsi="Times New Roman" w:cs="Times New Roman"/>
-          <w:sz w:val="24"/>
-          <w:szCs w:val="24"/>
-          <w:lang w:val="fr-FR"/>
-        </w:rPr>
-        <w:t>docker</w:t>
-      </w:r>
-      <w:proofErr w:type="gramEnd"/>
-      <w:r>
-        <w:rPr>
-          <w:rFonts w:ascii="Times New Roman" w:hAnsi="Times New Roman" w:cs="Times New Roman"/>
-          <w:sz w:val="24"/>
-          <w:szCs w:val="24"/>
-          <w:lang w:val="fr-FR"/>
-        </w:rPr>
-        <w:t xml:space="preserve"> compose up</w:t>
-      </w:r>
-    </w:p>
-    <w:p>
-      <w:pPr>
-        <w:spacing w:after="0"/>
-        <w:rPr>
-          <w:rFonts w:ascii="Times New Roman" w:hAnsi="Times New Roman" w:cs="Times New Roman"/>
-          <w:sz w:val="24"/>
-          <w:szCs w:val="24"/>
-          <w:lang w:val="fr-FR"/>
-        </w:rPr>
-      </w:pPr>
-    </w:p>
-    <w:p>
-      <w:pPr>
-        <w:spacing w:after="0"/>
-        <w:rPr>
-          <w:rFonts w:ascii="Times New Roman" w:hAnsi="Times New Roman" w:cs="Times New Roman"/>
-          <w:sz w:val="24"/>
-          <w:szCs w:val="24"/>
-          <w:lang w:val="fr-FR"/>
-        </w:rPr>
-      </w:pPr>
-    </w:p>
-    <w:p>
-      <w:pPr>
-        <w:spacing w:after="0"/>
-        <w:rPr>
-          <w:rFonts w:ascii="Times New Roman" w:hAnsi="Times New Roman" w:cs="Times New Roman"/>
-          <w:sz w:val="24"/>
-          <w:szCs w:val="24"/>
-          <w:lang w:val="fr-FR"/>
-        </w:rPr>
-      </w:pPr>
-      <w:r>
-        <w:rPr>
-          <w:rFonts w:ascii="Times New Roman" w:hAnsi="Times New Roman" w:cs="Times New Roman"/>
-          <w:sz w:val="24"/>
-          <w:szCs w:val="24"/>
-          <w:lang w:val="fr-FR"/>
-        </w:rPr>
-        <w:t>///////////////////////// //</w:t>
-      </w:r>
-    </w:p>
-    <w:p>
-      <w:pPr>
-        <w:pStyle w:val="pdq2pgselectionanchorcontainer"/>
-        <w:rPr>
-          <w:b/>
-        </w:rPr>
-      </w:pPr>
-      <w:r>
-        <w:rPr>
-          <w:rStyle w:val="CodeHTML"/>
-          <w:rFonts w:ascii="Times New Roman" w:hAnsi="Times New Roman" w:cs="Times New Roman"/>
-          <w:b/>
-          <w:bCs/>
-          <w:sz w:val="24"/>
-          <w:szCs w:val="24"/>
-        </w:rPr>
-        <w:t>devops_files.py</w:t>
-      </w:r>
-      <w:r>
-        <w:rPr>
-          <w:rStyle w:val="lev"/>
-          <w:b w:val="0"/>
-        </w:rPr>
-        <w:t xml:space="preserve"> prépare et contrôle automatiquement les ressources nécessaires au déploiement. Il détecte les </w:t>
-      </w:r>
-      <w:proofErr w:type="spellStart"/>
-      <w:r>
-        <w:rPr>
-          <w:rStyle w:val="lev"/>
-          <w:b w:val="0"/>
-        </w:rPr>
-        <w:t>microservices</w:t>
-      </w:r>
-      <w:proofErr w:type="spellEnd"/>
-      <w:r>
-        <w:rPr>
-          <w:rStyle w:val="lev"/>
-          <w:b w:val="0"/>
-        </w:rPr>
-        <w:t xml:space="preserve">, vérifie les </w:t>
-      </w:r>
-      <w:proofErr w:type="spellStart"/>
-      <w:r>
-        <w:rPr>
-          <w:rStyle w:val="lev"/>
-          <w:b w:val="0"/>
-        </w:rPr>
-        <w:t>Dockerfiles</w:t>
-      </w:r>
-      <w:proofErr w:type="spellEnd"/>
-      <w:r>
-        <w:rPr>
-          <w:rStyle w:val="lev"/>
-          <w:b w:val="0"/>
-        </w:rPr>
-        <w:t xml:space="preserve">, Docker Compose, </w:t>
-      </w:r>
-      <w:proofErr w:type="spellStart"/>
-      <w:r>
-        <w:rPr>
-          <w:rStyle w:val="lev"/>
-          <w:b w:val="0"/>
-        </w:rPr>
-        <w:t>Kubernetes</w:t>
-      </w:r>
-      <w:proofErr w:type="spellEnd"/>
-      <w:r>
-        <w:rPr>
-          <w:rStyle w:val="lev"/>
-          <w:b w:val="0"/>
-        </w:rPr>
-        <w:t xml:space="preserve"> et </w:t>
-      </w:r>
-      <w:proofErr w:type="spellStart"/>
-      <w:r>
-        <w:rPr>
-          <w:rStyle w:val="lev"/>
-          <w:b w:val="0"/>
-        </w:rPr>
-        <w:t>GitHub</w:t>
-      </w:r>
-      <w:proofErr w:type="spellEnd"/>
-      <w:r>
-        <w:rPr>
-          <w:rStyle w:val="lev"/>
-          <w:b w:val="0"/>
-        </w:rPr>
-        <w:t xml:space="preserve"> Actions, crée les fichiers techniques manquants et génère un rapport avant le lancement du pipeline </w:t>
-      </w:r>
-      <w:proofErr w:type="spellStart"/>
-      <w:r>
-        <w:rPr>
-          <w:rStyle w:val="lev"/>
-          <w:b w:val="0"/>
-        </w:rPr>
-        <w:t>DevOps</w:t>
-      </w:r>
-      <w:proofErr w:type="spellEnd"/>
-      <w:r>
-        <w:rPr>
-          <w:rStyle w:val="lev"/>
-          <w:b w:val="0"/>
-        </w:rPr>
-        <w:t>.</w:t>
-      </w:r>
-      <w:r>
-        <w:rPr>
-          <w:b/>
-        </w:rPr>
-        <w:t xml:space="preserve"> </w:t>
-      </w:r>
-    </w:p>
-    <w:p>
-      <w:pPr>
-        <w:spacing w:after="0"/>
-        <w:rPr>
-          <w:rFonts w:ascii="Times New Roman" w:hAnsi="Times New Roman" w:cs="Times New Roman"/>
-          <w:sz w:val="24"/>
-          <w:szCs w:val="24"/>
-          <w:lang w:val="fr-FR"/>
-        </w:rPr>
-      </w:pPr>
-      <w:r>
-        <w:rPr>
-          <w:rFonts w:ascii="Times New Roman" w:hAnsi="Times New Roman" w:cs="Times New Roman"/>
-          <w:sz w:val="24"/>
-          <w:szCs w:val="24"/>
-          <w:lang w:val="fr-FR"/>
-        </w:rPr>
-        <w:t>// //</w:t>
-      </w:r>
-    </w:p>
-    <w:p>
-      <w:pPr>
-        <w:spacing w:after="0"/>
-        <w:rPr>
-          <w:rFonts w:ascii="Times New Roman" w:hAnsi="Times New Roman" w:cs="Times New Roman"/>
-          <w:sz w:val="24"/>
-          <w:szCs w:val="24"/>
-          <w:lang w:val="fr-FR"/>
-        </w:rPr>
-      </w:pPr>
-      <w:r>
-        <w:rPr>
-          <w:rFonts w:ascii="Times New Roman" w:hAnsi="Times New Roman" w:cs="Times New Roman"/>
-          <w:sz w:val="24"/>
-          <w:szCs w:val="24"/>
-          <w:lang w:val="fr-FR"/>
-        </w:rPr>
-        <w:t>Fonctions principales :</w:t>
-      </w:r>
-    </w:p>
-    <w:p>
-      <w:pPr>
-        <w:spacing w:after="0"/>
-        <w:rPr>
-          <w:rFonts w:ascii="Times New Roman" w:hAnsi="Times New Roman" w:cs="Times New Roman"/>
-          <w:sz w:val="24"/>
-          <w:szCs w:val="24"/>
-          <w:lang w:val="fr-FR"/>
-        </w:rPr>
-      </w:pPr>
-      <w:r>
-        <w:rPr>
-          <w:rFonts w:ascii="Times New Roman" w:hAnsi="Times New Roman" w:cs="Times New Roman"/>
-          <w:sz w:val="24"/>
-          <w:szCs w:val="24"/>
-          <w:lang w:val="fr-FR"/>
-        </w:rPr>
-        <w:t xml:space="preserve">- détecte les </w:t>
-      </w:r>
-      <w:proofErr w:type="spellStart"/>
-      <w:r>
-        <w:rPr>
-          <w:rFonts w:ascii="Times New Roman" w:hAnsi="Times New Roman" w:cs="Times New Roman"/>
-          <w:sz w:val="24"/>
-          <w:szCs w:val="24"/>
-          <w:lang w:val="fr-FR"/>
-        </w:rPr>
-        <w:t>microservices</w:t>
-      </w:r>
-      <w:proofErr w:type="spellEnd"/>
-      <w:r>
-        <w:rPr>
-          <w:rFonts w:ascii="Times New Roman" w:hAnsi="Times New Roman" w:cs="Times New Roman"/>
-          <w:sz w:val="24"/>
-          <w:szCs w:val="24"/>
-          <w:lang w:val="fr-FR"/>
-        </w:rPr>
-        <w:t xml:space="preserve"> du projet ;</w:t>
-      </w:r>
-    </w:p>
-    <w:p>
-      <w:pPr>
-        <w:spacing w:after="0"/>
-        <w:rPr>
-          <w:rFonts w:ascii="Times New Roman" w:hAnsi="Times New Roman" w:cs="Times New Roman"/>
-          <w:sz w:val="24"/>
-          <w:szCs w:val="24"/>
-          <w:lang w:val="fr-FR"/>
-        </w:rPr>
-      </w:pPr>
-      <w:r>
-        <w:rPr>
-          <w:rFonts w:ascii="Times New Roman" w:hAnsi="Times New Roman" w:cs="Times New Roman"/>
-          <w:sz w:val="24"/>
-          <w:szCs w:val="24"/>
-          <w:lang w:val="fr-FR"/>
-        </w:rPr>
-        <w:t xml:space="preserve">- vérifie les </w:t>
-      </w:r>
-      <w:proofErr w:type="spellStart"/>
-      <w:r>
-        <w:rPr>
-          <w:rFonts w:ascii="Times New Roman" w:hAnsi="Times New Roman" w:cs="Times New Roman"/>
-          <w:sz w:val="24"/>
-          <w:szCs w:val="24"/>
-          <w:lang w:val="fr-FR"/>
-        </w:rPr>
-        <w:t>Dockerfile</w:t>
-      </w:r>
-      <w:proofErr w:type="spellEnd"/>
-      <w:r>
-        <w:rPr>
-          <w:rFonts w:ascii="Times New Roman" w:hAnsi="Times New Roman" w:cs="Times New Roman"/>
-          <w:sz w:val="24"/>
-          <w:szCs w:val="24"/>
-          <w:lang w:val="fr-FR"/>
-        </w:rPr>
-        <w:t xml:space="preserve">, pom.xml, </w:t>
-      </w:r>
-      <w:proofErr w:type="spellStart"/>
-      <w:r>
-        <w:rPr>
-          <w:rFonts w:ascii="Times New Roman" w:hAnsi="Times New Roman" w:cs="Times New Roman"/>
-          <w:sz w:val="24"/>
-          <w:szCs w:val="24"/>
-          <w:lang w:val="fr-FR"/>
-        </w:rPr>
-        <w:t>package.json</w:t>
-      </w:r>
-      <w:proofErr w:type="spellEnd"/>
-      <w:r>
-        <w:rPr>
-          <w:rFonts w:ascii="Times New Roman" w:hAnsi="Times New Roman" w:cs="Times New Roman"/>
-          <w:sz w:val="24"/>
-          <w:szCs w:val="24"/>
-          <w:lang w:val="fr-FR"/>
-        </w:rPr>
-        <w:t>, docker-</w:t>
-      </w:r>
-      <w:proofErr w:type="spellStart"/>
-      <w:r>
-        <w:rPr>
-          <w:rFonts w:ascii="Times New Roman" w:hAnsi="Times New Roman" w:cs="Times New Roman"/>
-          <w:sz w:val="24"/>
-          <w:szCs w:val="24"/>
-          <w:lang w:val="fr-FR"/>
-        </w:rPr>
-        <w:t>compose.yml</w:t>
-      </w:r>
-      <w:proofErr w:type="spellEnd"/>
-      <w:r>
-        <w:rPr>
-          <w:rFonts w:ascii="Times New Roman" w:hAnsi="Times New Roman" w:cs="Times New Roman"/>
-          <w:sz w:val="24"/>
-          <w:szCs w:val="24"/>
-          <w:lang w:val="fr-FR"/>
-        </w:rPr>
-        <w:t xml:space="preserve"> et .</w:t>
-      </w:r>
-      <w:proofErr w:type="spellStart"/>
-      <w:r>
-        <w:rPr>
-          <w:rFonts w:ascii="Times New Roman" w:hAnsi="Times New Roman" w:cs="Times New Roman"/>
-          <w:sz w:val="24"/>
-          <w:szCs w:val="24"/>
-          <w:lang w:val="fr-FR"/>
-        </w:rPr>
-        <w:t>env</w:t>
-      </w:r>
-      <w:proofErr w:type="spellEnd"/>
-      <w:r>
-        <w:rPr>
-          <w:rFonts w:ascii="Times New Roman" w:hAnsi="Times New Roman" w:cs="Times New Roman"/>
-          <w:sz w:val="24"/>
-          <w:szCs w:val="24"/>
-          <w:lang w:val="fr-FR"/>
-        </w:rPr>
-        <w:t xml:space="preserve"> ;</w:t>
-      </w:r>
-    </w:p>
-    <w:p>
-      <w:pPr>
-        <w:spacing w:after="0"/>
-        <w:rPr>
-          <w:rFonts w:ascii="Times New Roman" w:hAnsi="Times New Roman" w:cs="Times New Roman"/>
-          <w:sz w:val="24"/>
-          <w:szCs w:val="24"/>
-          <w:lang w:val="fr-FR"/>
-        </w:rPr>
-      </w:pPr>
-      <w:r>
-        <w:rPr>
-          <w:rFonts w:ascii="Times New Roman" w:hAnsi="Times New Roman" w:cs="Times New Roman"/>
-          <w:sz w:val="24"/>
-          <w:szCs w:val="24"/>
-          <w:lang w:val="fr-FR"/>
-        </w:rPr>
-        <w:t xml:space="preserve">- vérifie les ressources </w:t>
-      </w:r>
-      <w:proofErr w:type="spellStart"/>
-      <w:r>
-        <w:rPr>
-          <w:rFonts w:ascii="Times New Roman" w:hAnsi="Times New Roman" w:cs="Times New Roman"/>
-          <w:sz w:val="24"/>
-          <w:szCs w:val="24"/>
-          <w:lang w:val="fr-FR"/>
-        </w:rPr>
-        <w:t>Kubernetes</w:t>
-      </w:r>
-      <w:proofErr w:type="spellEnd"/>
-      <w:r>
-        <w:rPr>
-          <w:rFonts w:ascii="Times New Roman" w:hAnsi="Times New Roman" w:cs="Times New Roman"/>
-          <w:sz w:val="24"/>
-          <w:szCs w:val="24"/>
-          <w:lang w:val="fr-FR"/>
-        </w:rPr>
-        <w:t xml:space="preserve"> et les workflows </w:t>
-      </w:r>
-      <w:proofErr w:type="spellStart"/>
-      <w:r>
-        <w:rPr>
-          <w:rFonts w:ascii="Times New Roman" w:hAnsi="Times New Roman" w:cs="Times New Roman"/>
-          <w:sz w:val="24"/>
-          <w:szCs w:val="24"/>
-          <w:lang w:val="fr-FR"/>
-        </w:rPr>
-        <w:t>GitHub</w:t>
-      </w:r>
-      <w:proofErr w:type="spellEnd"/>
-      <w:r>
-        <w:rPr>
-          <w:rFonts w:ascii="Times New Roman" w:hAnsi="Times New Roman" w:cs="Times New Roman"/>
-          <w:sz w:val="24"/>
-          <w:szCs w:val="24"/>
-          <w:lang w:val="fr-FR"/>
-        </w:rPr>
-        <w:t xml:space="preserve"> Actions ;</w:t>
-      </w:r>
-    </w:p>
-    <w:p>
-      <w:pPr>
-        <w:spacing w:after="0"/>
-        <w:rPr>
-          <w:rFonts w:ascii="Times New Roman" w:hAnsi="Times New Roman" w:cs="Times New Roman"/>
-          <w:sz w:val="24"/>
-          <w:szCs w:val="24"/>
-          <w:lang w:val="fr-FR"/>
-        </w:rPr>
-      </w:pPr>
-      <w:r>
-        <w:rPr>
-          <w:rFonts w:ascii="Times New Roman" w:hAnsi="Times New Roman" w:cs="Times New Roman"/>
-          <w:sz w:val="24"/>
-          <w:szCs w:val="24"/>
-          <w:lang w:val="fr-FR"/>
-        </w:rPr>
-        <w:t xml:space="preserve">- crée les dossiers </w:t>
-      </w:r>
-      <w:proofErr w:type="spellStart"/>
-      <w:r>
-        <w:rPr>
-          <w:rFonts w:ascii="Times New Roman" w:hAnsi="Times New Roman" w:cs="Times New Roman"/>
-          <w:sz w:val="24"/>
-          <w:szCs w:val="24"/>
-          <w:lang w:val="fr-FR"/>
-        </w:rPr>
-        <w:t>DevOps</w:t>
-      </w:r>
-      <w:proofErr w:type="spellEnd"/>
-      <w:r>
-        <w:rPr>
-          <w:rFonts w:ascii="Times New Roman" w:hAnsi="Times New Roman" w:cs="Times New Roman"/>
-          <w:sz w:val="24"/>
-          <w:szCs w:val="24"/>
-          <w:lang w:val="fr-FR"/>
-        </w:rPr>
-        <w:t xml:space="preserve"> manquants ;</w:t>
-      </w:r>
-    </w:p>
-    <w:p>
-      <w:pPr>
-        <w:spacing w:after="0"/>
-        <w:rPr>
-          <w:rFonts w:ascii="Times New Roman" w:hAnsi="Times New Roman" w:cs="Times New Roman"/>
-          <w:sz w:val="24"/>
-          <w:szCs w:val="24"/>
-          <w:lang w:val="fr-FR"/>
-        </w:rPr>
-      </w:pPr>
-      <w:r>
-        <w:rPr>
-          <w:rFonts w:ascii="Times New Roman" w:hAnsi="Times New Roman" w:cs="Times New Roman"/>
-          <w:sz w:val="24"/>
-          <w:szCs w:val="24"/>
-          <w:lang w:val="fr-FR"/>
-        </w:rPr>
-        <w:t>- crée des fichiers .</w:t>
-      </w:r>
-      <w:proofErr w:type="spellStart"/>
-      <w:r>
-        <w:rPr>
-          <w:rFonts w:ascii="Times New Roman" w:hAnsi="Times New Roman" w:cs="Times New Roman"/>
-          <w:sz w:val="24"/>
-          <w:szCs w:val="24"/>
-          <w:lang w:val="fr-FR"/>
-        </w:rPr>
-        <w:t>dockerignore</w:t>
-      </w:r>
-      <w:proofErr w:type="spellEnd"/>
-      <w:r>
-        <w:rPr>
-          <w:rFonts w:ascii="Times New Roman" w:hAnsi="Times New Roman" w:cs="Times New Roman"/>
-          <w:sz w:val="24"/>
-          <w:szCs w:val="24"/>
-          <w:lang w:val="fr-FR"/>
-        </w:rPr>
-        <w:t xml:space="preserve"> standards lorsqu'ils sont absents ;</w:t>
-      </w:r>
-    </w:p>
-    <w:p>
-      <w:pPr>
-        <w:spacing w:after="0"/>
-        <w:rPr>
-          <w:rFonts w:ascii="Times New Roman" w:hAnsi="Times New Roman" w:cs="Times New Roman"/>
-          <w:sz w:val="24"/>
-          <w:szCs w:val="24"/>
-          <w:lang w:val="fr-FR"/>
-        </w:rPr>
-      </w:pPr>
-      <w:r>
-        <w:rPr>
-          <w:rFonts w:ascii="Times New Roman" w:hAnsi="Times New Roman" w:cs="Times New Roman"/>
-          <w:sz w:val="24"/>
-          <w:szCs w:val="24"/>
-          <w:lang w:val="fr-FR"/>
-        </w:rPr>
-        <w:t>- génère un rapport de préparation ;</w:t>
-      </w:r>
-    </w:p>
-    <w:p>
-      <w:pPr>
-        <w:spacing w:after="0"/>
-        <w:rPr>
-          <w:rFonts w:ascii="Times New Roman" w:hAnsi="Times New Roman" w:cs="Times New Roman"/>
-          <w:sz w:val="24"/>
-          <w:szCs w:val="24"/>
-          <w:lang w:val="fr-FR"/>
-        </w:rPr>
-      </w:pPr>
-      <w:r>
-        <w:rPr>
-          <w:rFonts w:ascii="Times New Roman" w:hAnsi="Times New Roman" w:cs="Times New Roman"/>
-          <w:sz w:val="24"/>
-          <w:szCs w:val="24"/>
-          <w:lang w:val="fr-FR"/>
-        </w:rPr>
-        <w:t>- peut constituer un dossier "</w:t>
-      </w:r>
-      <w:proofErr w:type="spellStart"/>
-      <w:r>
-        <w:rPr>
-          <w:rFonts w:ascii="Times New Roman" w:hAnsi="Times New Roman" w:cs="Times New Roman"/>
-          <w:sz w:val="24"/>
-          <w:szCs w:val="24"/>
-          <w:lang w:val="fr-FR"/>
-        </w:rPr>
-        <w:t>devops_bundle</w:t>
-      </w:r>
-      <w:proofErr w:type="spellEnd"/>
-      <w:r>
-        <w:rPr>
-          <w:rFonts w:ascii="Times New Roman" w:hAnsi="Times New Roman" w:cs="Times New Roman"/>
-          <w:sz w:val="24"/>
-          <w:szCs w:val="24"/>
-          <w:lang w:val="fr-FR"/>
-        </w:rPr>
-        <w:t>" sans modifier les fichiers sources.</w:t>
+        <w:spacing w:after="0" w:line="240" w:lineRule="auto"/>
+        <w:rPr>
+          <w:rFonts w:ascii="Times New Roman" w:eastAsia="Times New Roman" w:hAnsi="Times New Roman" w:cs="Times New Roman"/>
+          <w:sz w:val="24"/>
+          <w:szCs w:val="24"/>
+          <w:lang w:val="fr-FR" w:eastAsia="fr-FR"/>
+        </w:rPr>
+      </w:pPr>
+      <w:r>
+        <w:rPr>
+          <w:rFonts w:ascii="Times New Roman" w:eastAsia="Times New Roman" w:hAnsi="Times New Roman" w:cs="Times New Roman"/>
+          <w:sz w:val="24"/>
+          <w:szCs w:val="24"/>
+          <w:lang w:val="fr-FR" w:eastAsia="fr-FR"/>
+        </w:rPr>
+        <w:lastRenderedPageBreak/>
+        <w:t>Si vous voulez supprimer tous les conteneurs existants d’un coup :</w:t>
       </w:r>
       <w:bookmarkStart w:id="0" w:name="_GoBack"/>
       <w:bookmarkEnd w:id="0"/>
     </w:p>
     <w:p>
       <w:pPr>
-        <w:spacing w:after="0"/>
-        <w:rPr>
-          <w:rFonts w:ascii="Times New Roman" w:hAnsi="Times New Roman" w:cs="Times New Roman"/>
-          <w:sz w:val="24"/>
-          <w:szCs w:val="24"/>
-          <w:lang w:val="fr-FR"/>
-        </w:rPr>
-      </w:pPr>
+        <w:tabs>
+          <w:tab w:val="left" w:pos="916"/>
+          <w:tab w:val="left" w:pos="1832"/>
+          <w:tab w:val="left" w:pos="2748"/>
+          <w:tab w:val="left" w:pos="3664"/>
+          <w:tab w:val="left" w:pos="4580"/>
+          <w:tab w:val="left" w:pos="5496"/>
+          <w:tab w:val="left" w:pos="6412"/>
+          <w:tab w:val="left" w:pos="7328"/>
+          <w:tab w:val="left" w:pos="8244"/>
+          <w:tab w:val="left" w:pos="9160"/>
+          <w:tab w:val="left" w:pos="10076"/>
+          <w:tab w:val="left" w:pos="10992"/>
+          <w:tab w:val="left" w:pos="11908"/>
+          <w:tab w:val="left" w:pos="12824"/>
+          <w:tab w:val="left" w:pos="13740"/>
+          <w:tab w:val="left" w:pos="14656"/>
+        </w:tabs>
+        <w:spacing w:after="0" w:line="240" w:lineRule="auto"/>
+        <w:rPr>
+          <w:rFonts w:ascii="Courier New" w:eastAsia="Times New Roman" w:hAnsi="Courier New" w:cs="Courier New"/>
+          <w:color w:val="0070C0"/>
+          <w:sz w:val="20"/>
+          <w:szCs w:val="20"/>
+          <w:lang w:val="en-GB" w:eastAsia="fr-FR"/>
+        </w:rPr>
+      </w:pPr>
+      <w:proofErr w:type="spellStart"/>
+      <w:proofErr w:type="gramStart"/>
+      <w:r>
+        <w:rPr>
+          <w:rFonts w:ascii="Courier New" w:eastAsia="Times New Roman" w:hAnsi="Courier New" w:cs="Courier New"/>
+          <w:color w:val="0070C0"/>
+          <w:sz w:val="20"/>
+          <w:szCs w:val="20"/>
+          <w:lang w:val="en-GB" w:eastAsia="fr-FR"/>
+        </w:rPr>
+        <w:t>docker</w:t>
+      </w:r>
+      <w:proofErr w:type="spellEnd"/>
+      <w:proofErr w:type="gramEnd"/>
+      <w:r>
+        <w:rPr>
+          <w:rFonts w:ascii="Courier New" w:eastAsia="Times New Roman" w:hAnsi="Courier New" w:cs="Courier New"/>
+          <w:color w:val="0070C0"/>
+          <w:sz w:val="20"/>
+          <w:szCs w:val="20"/>
+          <w:lang w:val="en-GB" w:eastAsia="fr-FR"/>
+        </w:rPr>
+        <w:t xml:space="preserve"> </w:t>
+      </w:r>
+      <w:proofErr w:type="spellStart"/>
+      <w:r>
+        <w:rPr>
+          <w:rFonts w:ascii="Courier New" w:eastAsia="Times New Roman" w:hAnsi="Courier New" w:cs="Courier New"/>
+          <w:color w:val="0070C0"/>
+          <w:sz w:val="20"/>
+          <w:szCs w:val="20"/>
+          <w:lang w:val="en-GB" w:eastAsia="fr-FR"/>
+        </w:rPr>
+        <w:t>rm</w:t>
+      </w:r>
+      <w:proofErr w:type="spellEnd"/>
+      <w:r>
+        <w:rPr>
+          <w:rFonts w:ascii="Courier New" w:eastAsia="Times New Roman" w:hAnsi="Courier New" w:cs="Courier New"/>
+          <w:color w:val="0070C0"/>
+          <w:sz w:val="20"/>
+          <w:szCs w:val="20"/>
+          <w:lang w:val="en-GB" w:eastAsia="fr-FR"/>
+        </w:rPr>
+        <w:t xml:space="preserve"> -f $(</w:t>
+      </w:r>
+      <w:proofErr w:type="spellStart"/>
+      <w:r>
+        <w:rPr>
+          <w:rFonts w:ascii="Courier New" w:eastAsia="Times New Roman" w:hAnsi="Courier New" w:cs="Courier New"/>
+          <w:color w:val="0070C0"/>
+          <w:sz w:val="20"/>
+          <w:szCs w:val="20"/>
+          <w:lang w:val="en-GB" w:eastAsia="fr-FR"/>
+        </w:rPr>
+        <w:t>docker</w:t>
+      </w:r>
+      <w:proofErr w:type="spellEnd"/>
+      <w:r>
+        <w:rPr>
+          <w:rFonts w:ascii="Courier New" w:eastAsia="Times New Roman" w:hAnsi="Courier New" w:cs="Courier New"/>
+          <w:color w:val="0070C0"/>
+          <w:sz w:val="20"/>
+          <w:szCs w:val="20"/>
+          <w:lang w:val="en-GB" w:eastAsia="fr-FR"/>
+        </w:rPr>
+        <w:t xml:space="preserve"> </w:t>
+      </w:r>
+      <w:proofErr w:type="spellStart"/>
+      <w:r>
+        <w:rPr>
+          <w:rFonts w:ascii="Courier New" w:eastAsia="Times New Roman" w:hAnsi="Courier New" w:cs="Courier New"/>
+          <w:color w:val="0070C0"/>
+          <w:sz w:val="20"/>
+          <w:szCs w:val="20"/>
+          <w:lang w:val="en-GB" w:eastAsia="fr-FR"/>
+        </w:rPr>
+        <w:t>ps</w:t>
+      </w:r>
+      <w:proofErr w:type="spellEnd"/>
+      <w:r>
+        <w:rPr>
+          <w:rFonts w:ascii="Courier New" w:eastAsia="Times New Roman" w:hAnsi="Courier New" w:cs="Courier New"/>
+          <w:color w:val="0070C0"/>
+          <w:sz w:val="20"/>
+          <w:szCs w:val="20"/>
+          <w:lang w:val="en-GB" w:eastAsia="fr-FR"/>
+        </w:rPr>
+        <w:t xml:space="preserve"> -</w:t>
+      </w:r>
+      <w:proofErr w:type="spellStart"/>
+      <w:r>
+        <w:rPr>
+          <w:rFonts w:ascii="Courier New" w:eastAsia="Times New Roman" w:hAnsi="Courier New" w:cs="Courier New"/>
+          <w:color w:val="0070C0"/>
+          <w:sz w:val="20"/>
+          <w:szCs w:val="20"/>
+          <w:lang w:val="en-GB" w:eastAsia="fr-FR"/>
+        </w:rPr>
+        <w:t>aq</w:t>
+      </w:r>
+      <w:proofErr w:type="spellEnd"/>
+      <w:r>
+        <w:rPr>
+          <w:rFonts w:ascii="Courier New" w:eastAsia="Times New Roman" w:hAnsi="Courier New" w:cs="Courier New"/>
+          <w:color w:val="0070C0"/>
+          <w:sz w:val="20"/>
+          <w:szCs w:val="20"/>
+          <w:lang w:val="en-GB" w:eastAsia="fr-FR"/>
+        </w:rPr>
+        <w:t>)</w:t>
+      </w:r>
     </w:p>
     <w:p>
       <w:pPr>
         <w:spacing w:after="0"/>
         <w:rPr>
-          <w:rFonts w:ascii="Times New Roman" w:hAnsi="Times New Roman" w:cs="Times New Roman"/>
-          <w:sz w:val="24"/>
-          <w:szCs w:val="24"/>
-          <w:lang w:val="fr-FR"/>
-        </w:rPr>
-      </w:pPr>
-      <w:r>
-        <w:rPr>
-          <w:rFonts w:ascii="Times New Roman" w:hAnsi="Times New Roman" w:cs="Times New Roman"/>
-          <w:sz w:val="24"/>
-          <w:szCs w:val="24"/>
-          <w:lang w:val="fr-FR"/>
-        </w:rPr>
-        <w:t>Le script n'est pas exécuté automatiquement par Docker Compose.</w:t>
-      </w:r>
+          <w:rStyle w:val="l"/>
+          <w:rFonts w:ascii="Times New Roman" w:hAnsi="Times New Roman" w:cs="Times New Roman"/>
+          <w:sz w:val="24"/>
+          <w:szCs w:val="24"/>
+          <w:lang w:val="en-GB"/>
+        </w:rPr>
+      </w:pPr>
+      <w:proofErr w:type="spellStart"/>
+      <w:r>
+        <w:rPr>
+          <w:rStyle w:val="l"/>
+          <w:rFonts w:ascii="Times New Roman" w:hAnsi="Times New Roman" w:cs="Times New Roman"/>
+          <w:sz w:val="24"/>
+          <w:szCs w:val="24"/>
+          <w:lang w:val="en-GB"/>
+        </w:rPr>
+        <w:t>Puis</w:t>
+      </w:r>
+      <w:proofErr w:type="spellEnd"/>
+      <w:r>
+        <w:rPr>
+          <w:rStyle w:val="l"/>
+          <w:rFonts w:ascii="Times New Roman" w:hAnsi="Times New Roman" w:cs="Times New Roman"/>
+          <w:sz w:val="24"/>
+          <w:szCs w:val="24"/>
+          <w:lang w:val="en-GB"/>
+        </w:rPr>
+        <w:t xml:space="preserve"> </w:t>
+      </w:r>
+      <w:proofErr w:type="spellStart"/>
+      <w:proofErr w:type="gramStart"/>
+      <w:r>
+        <w:rPr>
+          <w:rStyle w:val="l"/>
+          <w:rFonts w:ascii="Times New Roman" w:hAnsi="Times New Roman" w:cs="Times New Roman"/>
+          <w:sz w:val="24"/>
+          <w:szCs w:val="24"/>
+          <w:lang w:val="en-GB"/>
+        </w:rPr>
+        <w:t>contrôlez</w:t>
+      </w:r>
+      <w:proofErr w:type="spellEnd"/>
+      <w:r>
+        <w:rPr>
+          <w:rStyle w:val="l"/>
+          <w:rFonts w:ascii="Times New Roman" w:hAnsi="Times New Roman" w:cs="Times New Roman"/>
+          <w:sz w:val="24"/>
+          <w:szCs w:val="24"/>
+          <w:lang w:val="en-GB"/>
+        </w:rPr>
+        <w:t xml:space="preserve"> :</w:t>
+      </w:r>
+      <w:proofErr w:type="gramEnd"/>
     </w:p>
     <w:p>
       <w:pPr>
         <w:spacing w:after="0"/>
         <w:rPr>
-          <w:rFonts w:ascii="Times New Roman" w:hAnsi="Times New Roman" w:cs="Times New Roman"/>
-          <w:sz w:val="24"/>
-          <w:szCs w:val="24"/>
-          <w:lang w:val="fr-FR"/>
-        </w:rPr>
-      </w:pPr>
-      <w:r>
-        <w:rPr>
-          <w:rFonts w:ascii="Times New Roman" w:hAnsi="Times New Roman" w:cs="Times New Roman"/>
-          <w:sz w:val="24"/>
-          <w:szCs w:val="24"/>
-          <w:lang w:val="fr-FR"/>
-        </w:rPr>
-        <w:t>Il doit être lancé explicitement :</w:t>
+          <w:rStyle w:val="l"/>
+          <w:rFonts w:ascii="Times New Roman" w:hAnsi="Times New Roman" w:cs="Times New Roman"/>
+          <w:color w:val="0070C0"/>
+          <w:sz w:val="24"/>
+          <w:szCs w:val="24"/>
+          <w:lang w:val="en-GB"/>
+        </w:rPr>
+      </w:pPr>
+      <w:proofErr w:type="spellStart"/>
+      <w:proofErr w:type="gramStart"/>
+      <w:r>
+        <w:rPr>
+          <w:rStyle w:val="l"/>
+          <w:rFonts w:ascii="Times New Roman" w:hAnsi="Times New Roman" w:cs="Times New Roman"/>
+          <w:color w:val="0070C0"/>
+          <w:sz w:val="24"/>
+          <w:szCs w:val="24"/>
+          <w:lang w:val="en-GB"/>
+        </w:rPr>
+        <w:t>docker</w:t>
+      </w:r>
+      <w:proofErr w:type="spellEnd"/>
+      <w:proofErr w:type="gramEnd"/>
+      <w:r>
+        <w:rPr>
+          <w:rStyle w:val="l"/>
+          <w:rFonts w:ascii="Times New Roman" w:hAnsi="Times New Roman" w:cs="Times New Roman"/>
+          <w:color w:val="0070C0"/>
+          <w:sz w:val="24"/>
+          <w:szCs w:val="24"/>
+          <w:lang w:val="en-GB"/>
+        </w:rPr>
+        <w:t xml:space="preserve"> </w:t>
+      </w:r>
+      <w:proofErr w:type="spellStart"/>
+      <w:r>
+        <w:rPr>
+          <w:rStyle w:val="l"/>
+          <w:rFonts w:ascii="Times New Roman" w:hAnsi="Times New Roman" w:cs="Times New Roman"/>
+          <w:color w:val="0070C0"/>
+          <w:sz w:val="24"/>
+          <w:szCs w:val="24"/>
+          <w:lang w:val="en-GB"/>
+        </w:rPr>
+        <w:t>ps</w:t>
+      </w:r>
+      <w:proofErr w:type="spellEnd"/>
+      <w:r>
+        <w:rPr>
+          <w:rStyle w:val="l"/>
+          <w:rFonts w:ascii="Times New Roman" w:hAnsi="Times New Roman" w:cs="Times New Roman"/>
+          <w:color w:val="0070C0"/>
+          <w:sz w:val="24"/>
+          <w:szCs w:val="24"/>
+          <w:lang w:val="en-GB"/>
+        </w:rPr>
+        <w:t xml:space="preserve"> -a</w:t>
       </w:r>
     </w:p>
     <w:p>
       <w:pPr>
         <w:spacing w:after="0"/>
         <w:rPr>
+          <w:rStyle w:val="l"/>
           <w:rFonts w:ascii="Times New Roman" w:hAnsi="Times New Roman" w:cs="Times New Roman"/>
           <w:sz w:val="24"/>
           <w:szCs w:val="24"/>
@@ -5840,32 +5448,13 @@
       </w:pPr>
       <w:r>
         <w:rPr>
+          <w:rStyle w:val="l"/>
           <w:rFonts w:ascii="Times New Roman" w:hAnsi="Times New Roman" w:cs="Times New Roman"/>
           <w:sz w:val="24"/>
           <w:szCs w:val="24"/>
           <w:lang w:val="fr-FR"/>
         </w:rPr>
-        <w:t xml:space="preserve">    </w:t>
-      </w:r>
-      <w:proofErr w:type="gramStart"/>
-      <w:r>
-        <w:rPr>
-          <w:rFonts w:ascii="Times New Roman" w:hAnsi="Times New Roman" w:cs="Times New Roman"/>
-          <w:sz w:val="24"/>
-          <w:szCs w:val="24"/>
-          <w:lang w:val="fr-FR"/>
-        </w:rPr>
-        <w:t>python</w:t>
-      </w:r>
-      <w:proofErr w:type="gramEnd"/>
-      <w:r>
-        <w:rPr>
-          <w:rFonts w:ascii="Times New Roman" w:hAnsi="Times New Roman" w:cs="Times New Roman"/>
-          <w:sz w:val="24"/>
-          <w:szCs w:val="24"/>
-          <w:lang w:val="fr-FR"/>
-        </w:rPr>
-        <w:t xml:space="preserve"> devops_files.py check</w:t>
+        <w:t>//</w:t>
       </w:r>
     </w:p>
     <w:p>
@@ -5885,9 +5474,9 @@
           <w:szCs w:val="24"/>
           <w:lang w:val="fr-FR"/>
         </w:rPr>
-        <w:t xml:space="preserve">    </w:t>
-      </w:r>
-      <w:proofErr w:type="gramStart"/>
+        <w:t xml:space="preserve">Lancer les conteneurs, après le </w:t>
+      </w:r>
+      <w:proofErr w:type="spellStart"/>
       <w:r>
         <w:rPr>
           <w:rFonts w:ascii="Times New Roman" w:hAnsi="Times New Roman" w:cs="Times New Roman"/>
@@ -5895,9 +5484,9 @@
           <w:szCs w:val="24"/>
           <w:lang w:val="fr-FR"/>
         </w:rPr>
-        <w:t>python</w:t>
-      </w:r>
-      <w:proofErr w:type="gramEnd"/>
+        <w:t>build</w:t>
+      </w:r>
+      <w:proofErr w:type="spellEnd"/>
       <w:r>
         <w:rPr>
           <w:rFonts w:ascii="Times New Roman" w:hAnsi="Times New Roman" w:cs="Times New Roman"/>
@@ -5905,19 +5494,8 @@
           <w:szCs w:val="24"/>
           <w:lang w:val="fr-FR"/>
         </w:rPr>
-        <w:t xml:space="preserve"> devops_files.py </w:t>
-      </w:r>
-      <w:proofErr w:type="spellStart"/>
-      <w:r>
-        <w:rPr>
-          <w:rFonts w:ascii="Times New Roman" w:hAnsi="Times New Roman" w:cs="Times New Roman"/>
-          <w:sz w:val="24"/>
-          <w:szCs w:val="24"/>
-          <w:lang w:val="fr-FR"/>
-        </w:rPr>
-        <w:t>prepare</w:t>
-      </w:r>
-      <w:proofErr w:type="spellEnd"/>
+        <w:t>, il faut exécuter :</w:t>
+      </w:r>
     </w:p>
     <w:p>
       <w:pPr>
@@ -5929,12 +5507,719 @@
           <w:lang w:val="fr-FR"/>
         </w:rPr>
       </w:pPr>
-      <w:r>
+    </w:p>
+    <w:p>
+      <w:pPr>
+        <w:spacing w:after="0"/>
         <w:rPr>
           <w:rFonts w:ascii="Times New Roman" w:hAnsi="Times New Roman" w:cs="Times New Roman"/>
           <w:sz w:val="24"/>
           <w:szCs w:val="24"/>
           <w:lang w:val="fr-FR"/>
+        </w:rPr>
+      </w:pPr>
+      <w:proofErr w:type="gramStart"/>
+      <w:r>
+        <w:rPr>
+          <w:rFonts w:ascii="Times New Roman" w:hAnsi="Times New Roman" w:cs="Times New Roman"/>
+          <w:sz w:val="24"/>
+          <w:szCs w:val="24"/>
+          <w:lang w:val="fr-FR"/>
+        </w:rPr>
+        <w:t>docker</w:t>
+      </w:r>
+      <w:proofErr w:type="gramEnd"/>
+      <w:r>
+        <w:rPr>
+          <w:rFonts w:ascii="Times New Roman" w:hAnsi="Times New Roman" w:cs="Times New Roman"/>
+          <w:sz w:val="24"/>
+          <w:szCs w:val="24"/>
+          <w:lang w:val="fr-FR"/>
+        </w:rPr>
+        <w:t xml:space="preserve"> compose up</w:t>
+      </w:r>
+    </w:p>
+    <w:p>
+      <w:pPr>
+        <w:spacing w:after="0"/>
+        <w:rPr>
+          <w:rFonts w:ascii="Times New Roman" w:hAnsi="Times New Roman" w:cs="Times New Roman"/>
+          <w:sz w:val="24"/>
+          <w:szCs w:val="24"/>
+          <w:lang w:val="fr-FR"/>
+        </w:rPr>
+      </w:pPr>
+    </w:p>
+    <w:p>
+      <w:pPr>
+        <w:spacing w:after="0"/>
+        <w:rPr>
+          <w:rFonts w:ascii="Times New Roman" w:hAnsi="Times New Roman" w:cs="Times New Roman"/>
+          <w:sz w:val="24"/>
+          <w:szCs w:val="24"/>
+          <w:lang w:val="fr-FR"/>
+        </w:rPr>
+      </w:pPr>
+    </w:p>
+    <w:p>
+      <w:pPr>
+        <w:spacing w:after="0"/>
+        <w:rPr>
+          <w:rFonts w:ascii="Times New Roman" w:hAnsi="Times New Roman" w:cs="Times New Roman"/>
+          <w:sz w:val="24"/>
+          <w:szCs w:val="24"/>
+          <w:lang w:val="fr-FR"/>
+        </w:rPr>
+      </w:pPr>
+      <w:r>
+        <w:rPr>
+          <w:rFonts w:ascii="Times New Roman" w:hAnsi="Times New Roman" w:cs="Times New Roman"/>
+          <w:sz w:val="24"/>
+          <w:szCs w:val="24"/>
+          <w:lang w:val="fr-FR"/>
+        </w:rPr>
+        <w:t>///////////////////////// //</w:t>
+      </w:r>
+    </w:p>
+    <w:p>
+      <w:pPr>
+        <w:pStyle w:val="pdq2pgselectionanchorcontainer"/>
+        <w:rPr>
+          <w:b/>
+        </w:rPr>
+      </w:pPr>
+      <w:r>
+        <w:rPr>
+          <w:rStyle w:val="CodeHTML"/>
+          <w:rFonts w:ascii="Times New Roman" w:hAnsi="Times New Roman" w:cs="Times New Roman"/>
+          <w:b/>
+          <w:bCs/>
+          <w:sz w:val="24"/>
+          <w:szCs w:val="24"/>
+        </w:rPr>
+        <w:t>devops_files.py</w:t>
+      </w:r>
+      <w:r>
+        <w:rPr>
+          <w:rStyle w:val="lev"/>
+          <w:b w:val="0"/>
+        </w:rPr>
+        <w:t xml:space="preserve"> prépare et contrôle automatiquement les ressources nécessaires au déploiement. Il détecte les </w:t>
+      </w:r>
+      <w:proofErr w:type="spellStart"/>
+      <w:r>
+        <w:rPr>
+          <w:rStyle w:val="lev"/>
+          <w:b w:val="0"/>
+        </w:rPr>
+        <w:t>microservices</w:t>
+      </w:r>
+      <w:proofErr w:type="spellEnd"/>
+      <w:r>
+        <w:rPr>
+          <w:rStyle w:val="lev"/>
+          <w:b w:val="0"/>
+        </w:rPr>
+        <w:t xml:space="preserve">, vérifie les </w:t>
+      </w:r>
+      <w:proofErr w:type="spellStart"/>
+      <w:r>
+        <w:rPr>
+          <w:rStyle w:val="lev"/>
+          <w:b w:val="0"/>
+        </w:rPr>
+        <w:t>Dockerfiles</w:t>
+      </w:r>
+      <w:proofErr w:type="spellEnd"/>
+      <w:r>
+        <w:rPr>
+          <w:rStyle w:val="lev"/>
+          <w:b w:val="0"/>
+        </w:rPr>
+        <w:t xml:space="preserve">, Docker Compose, </w:t>
+      </w:r>
+      <w:proofErr w:type="spellStart"/>
+      <w:r>
+        <w:rPr>
+          <w:rStyle w:val="lev"/>
+          <w:b w:val="0"/>
+        </w:rPr>
+        <w:t>Kubernetes</w:t>
+      </w:r>
+      <w:proofErr w:type="spellEnd"/>
+      <w:r>
+        <w:rPr>
+          <w:rStyle w:val="lev"/>
+          <w:b w:val="0"/>
+        </w:rPr>
+        <w:t xml:space="preserve"> et </w:t>
+      </w:r>
+      <w:proofErr w:type="spellStart"/>
+      <w:r>
+        <w:rPr>
+          <w:rStyle w:val="lev"/>
+          <w:b w:val="0"/>
+        </w:rPr>
+        <w:t>GitHub</w:t>
+      </w:r>
+      <w:proofErr w:type="spellEnd"/>
+      <w:r>
+        <w:rPr>
+          <w:rStyle w:val="lev"/>
+          <w:b w:val="0"/>
+        </w:rPr>
+        <w:t xml:space="preserve"> Actions, crée les fichiers techniques manquants et génère un rapport avant le lancement du pipeline </w:t>
+      </w:r>
+      <w:proofErr w:type="spellStart"/>
+      <w:r>
+        <w:rPr>
+          <w:rStyle w:val="lev"/>
+          <w:b w:val="0"/>
+        </w:rPr>
+        <w:t>DevOps</w:t>
+      </w:r>
+      <w:proofErr w:type="spellEnd"/>
+      <w:r>
+        <w:rPr>
+          <w:rStyle w:val="lev"/>
+          <w:b w:val="0"/>
+        </w:rPr>
+        <w:t>.</w:t>
+      </w:r>
+      <w:r>
+        <w:rPr>
+          <w:b/>
+        </w:rPr>
+        <w:t xml:space="preserve"> </w:t>
+      </w:r>
+    </w:p>
+    <w:p>
+      <w:pPr>
+        <w:spacing w:after="0"/>
+        <w:rPr>
+          <w:rFonts w:ascii="Times New Roman" w:hAnsi="Times New Roman" w:cs="Times New Roman"/>
+          <w:sz w:val="24"/>
+          <w:szCs w:val="24"/>
+          <w:lang w:val="fr-FR"/>
+        </w:rPr>
+      </w:pPr>
+      <w:r>
+        <w:rPr>
+          <w:rFonts w:ascii="Times New Roman" w:hAnsi="Times New Roman" w:cs="Times New Roman"/>
+          <w:sz w:val="24"/>
+          <w:szCs w:val="24"/>
+          <w:lang w:val="fr-FR"/>
+        </w:rPr>
+        <w:t>// //</w:t>
+      </w:r>
+    </w:p>
+    <w:p>
+      <w:pPr>
+        <w:spacing w:after="0"/>
+        <w:rPr>
+          <w:rFonts w:ascii="Times New Roman" w:hAnsi="Times New Roman" w:cs="Times New Roman"/>
+          <w:sz w:val="24"/>
+          <w:szCs w:val="24"/>
+          <w:lang w:val="fr-FR"/>
+        </w:rPr>
+      </w:pPr>
+      <w:r>
+        <w:rPr>
+          <w:rFonts w:ascii="Times New Roman" w:hAnsi="Times New Roman" w:cs="Times New Roman"/>
+          <w:sz w:val="24"/>
+          <w:szCs w:val="24"/>
+          <w:lang w:val="fr-FR"/>
+        </w:rPr>
+        <w:t>Fonctions principales :</w:t>
+      </w:r>
+    </w:p>
+    <w:p>
+      <w:pPr>
+        <w:spacing w:after="0"/>
+        <w:rPr>
+          <w:rFonts w:ascii="Times New Roman" w:hAnsi="Times New Roman" w:cs="Times New Roman"/>
+          <w:sz w:val="24"/>
+          <w:szCs w:val="24"/>
+          <w:lang w:val="fr-FR"/>
+        </w:rPr>
+      </w:pPr>
+      <w:r>
+        <w:rPr>
+          <w:rFonts w:ascii="Times New Roman" w:hAnsi="Times New Roman" w:cs="Times New Roman"/>
+          <w:sz w:val="24"/>
+          <w:szCs w:val="24"/>
+          <w:lang w:val="fr-FR"/>
+        </w:rPr>
+        <w:t xml:space="preserve">- détecte les </w:t>
+      </w:r>
+      <w:proofErr w:type="spellStart"/>
+      <w:r>
+        <w:rPr>
+          <w:rFonts w:ascii="Times New Roman" w:hAnsi="Times New Roman" w:cs="Times New Roman"/>
+          <w:sz w:val="24"/>
+          <w:szCs w:val="24"/>
+          <w:lang w:val="fr-FR"/>
+        </w:rPr>
+        <w:t>microservices</w:t>
+      </w:r>
+      <w:proofErr w:type="spellEnd"/>
+      <w:r>
+        <w:rPr>
+          <w:rFonts w:ascii="Times New Roman" w:hAnsi="Times New Roman" w:cs="Times New Roman"/>
+          <w:sz w:val="24"/>
+          <w:szCs w:val="24"/>
+          <w:lang w:val="fr-FR"/>
+        </w:rPr>
+        <w:t xml:space="preserve"> du projet ;</w:t>
+      </w:r>
+    </w:p>
+    <w:p>
+      <w:pPr>
+        <w:spacing w:after="0"/>
+        <w:rPr>
+          <w:rFonts w:ascii="Times New Roman" w:hAnsi="Times New Roman" w:cs="Times New Roman"/>
+          <w:sz w:val="24"/>
+          <w:szCs w:val="24"/>
+          <w:lang w:val="fr-FR"/>
+        </w:rPr>
+      </w:pPr>
+      <w:r>
+        <w:rPr>
+          <w:rFonts w:ascii="Times New Roman" w:hAnsi="Times New Roman" w:cs="Times New Roman"/>
+          <w:sz w:val="24"/>
+          <w:szCs w:val="24"/>
+          <w:lang w:val="fr-FR"/>
+        </w:rPr>
+        <w:t xml:space="preserve">- vérifie les </w:t>
+      </w:r>
+      <w:proofErr w:type="spellStart"/>
+      <w:r>
+        <w:rPr>
+          <w:rFonts w:ascii="Times New Roman" w:hAnsi="Times New Roman" w:cs="Times New Roman"/>
+          <w:sz w:val="24"/>
+          <w:szCs w:val="24"/>
+          <w:lang w:val="fr-FR"/>
+        </w:rPr>
+        <w:t>Dockerfile</w:t>
+      </w:r>
+      <w:proofErr w:type="spellEnd"/>
+      <w:r>
+        <w:rPr>
+          <w:rFonts w:ascii="Times New Roman" w:hAnsi="Times New Roman" w:cs="Times New Roman"/>
+          <w:sz w:val="24"/>
+          <w:szCs w:val="24"/>
+          <w:lang w:val="fr-FR"/>
+        </w:rPr>
+        <w:t xml:space="preserve">, pom.xml, </w:t>
+      </w:r>
+      <w:proofErr w:type="spellStart"/>
+      <w:r>
+        <w:rPr>
+          <w:rFonts w:ascii="Times New Roman" w:hAnsi="Times New Roman" w:cs="Times New Roman"/>
+          <w:sz w:val="24"/>
+          <w:szCs w:val="24"/>
+          <w:lang w:val="fr-FR"/>
+        </w:rPr>
+        <w:t>package.json</w:t>
+      </w:r>
+      <w:proofErr w:type="spellEnd"/>
+      <w:r>
+        <w:rPr>
+          <w:rFonts w:ascii="Times New Roman" w:hAnsi="Times New Roman" w:cs="Times New Roman"/>
+          <w:sz w:val="24"/>
+          <w:szCs w:val="24"/>
+          <w:lang w:val="fr-FR"/>
+        </w:rPr>
+        <w:t>, docker-</w:t>
+      </w:r>
+      <w:proofErr w:type="spellStart"/>
+      <w:r>
+        <w:rPr>
+          <w:rFonts w:ascii="Times New Roman" w:hAnsi="Times New Roman" w:cs="Times New Roman"/>
+          <w:sz w:val="24"/>
+          <w:szCs w:val="24"/>
+          <w:lang w:val="fr-FR"/>
+        </w:rPr>
+        <w:t>compose.yml</w:t>
+      </w:r>
+      <w:proofErr w:type="spellEnd"/>
+      <w:r>
+        <w:rPr>
+          <w:rFonts w:ascii="Times New Roman" w:hAnsi="Times New Roman" w:cs="Times New Roman"/>
+          <w:sz w:val="24"/>
+          <w:szCs w:val="24"/>
+          <w:lang w:val="fr-FR"/>
+        </w:rPr>
+        <w:t xml:space="preserve"> et .</w:t>
+      </w:r>
+      <w:proofErr w:type="spellStart"/>
+      <w:r>
+        <w:rPr>
+          <w:rFonts w:ascii="Times New Roman" w:hAnsi="Times New Roman" w:cs="Times New Roman"/>
+          <w:sz w:val="24"/>
+          <w:szCs w:val="24"/>
+          <w:lang w:val="fr-FR"/>
+        </w:rPr>
+        <w:t>env</w:t>
+      </w:r>
+      <w:proofErr w:type="spellEnd"/>
+      <w:r>
+        <w:rPr>
+          <w:rFonts w:ascii="Times New Roman" w:hAnsi="Times New Roman" w:cs="Times New Roman"/>
+          <w:sz w:val="24"/>
+          <w:szCs w:val="24"/>
+          <w:lang w:val="fr-FR"/>
+        </w:rPr>
+        <w:t xml:space="preserve"> ;</w:t>
+      </w:r>
+    </w:p>
+    <w:p>
+      <w:pPr>
+        <w:spacing w:after="0"/>
+        <w:rPr>
+          <w:rFonts w:ascii="Times New Roman" w:hAnsi="Times New Roman" w:cs="Times New Roman"/>
+          <w:sz w:val="24"/>
+          <w:szCs w:val="24"/>
+          <w:lang w:val="fr-FR"/>
+        </w:rPr>
+      </w:pPr>
+      <w:r>
+        <w:rPr>
+          <w:rFonts w:ascii="Times New Roman" w:hAnsi="Times New Roman" w:cs="Times New Roman"/>
+          <w:sz w:val="24"/>
+          <w:szCs w:val="24"/>
+          <w:lang w:val="fr-FR"/>
+        </w:rPr>
+        <w:t xml:space="preserve">- vérifie les ressources </w:t>
+      </w:r>
+      <w:proofErr w:type="spellStart"/>
+      <w:r>
+        <w:rPr>
+          <w:rFonts w:ascii="Times New Roman" w:hAnsi="Times New Roman" w:cs="Times New Roman"/>
+          <w:sz w:val="24"/>
+          <w:szCs w:val="24"/>
+          <w:lang w:val="fr-FR"/>
+        </w:rPr>
+        <w:t>Kubernetes</w:t>
+      </w:r>
+      <w:proofErr w:type="spellEnd"/>
+      <w:r>
+        <w:rPr>
+          <w:rFonts w:ascii="Times New Roman" w:hAnsi="Times New Roman" w:cs="Times New Roman"/>
+          <w:sz w:val="24"/>
+          <w:szCs w:val="24"/>
+          <w:lang w:val="fr-FR"/>
+        </w:rPr>
+        <w:t xml:space="preserve"> et les workflows </w:t>
+      </w:r>
+      <w:proofErr w:type="spellStart"/>
+      <w:r>
+        <w:rPr>
+          <w:rFonts w:ascii="Times New Roman" w:hAnsi="Times New Roman" w:cs="Times New Roman"/>
+          <w:sz w:val="24"/>
+          <w:szCs w:val="24"/>
+          <w:lang w:val="fr-FR"/>
+        </w:rPr>
+        <w:t>GitHub</w:t>
+      </w:r>
+      <w:proofErr w:type="spellEnd"/>
+      <w:r>
+        <w:rPr>
+          <w:rFonts w:ascii="Times New Roman" w:hAnsi="Times New Roman" w:cs="Times New Roman"/>
+          <w:sz w:val="24"/>
+          <w:szCs w:val="24"/>
+          <w:lang w:val="fr-FR"/>
+        </w:rPr>
+        <w:t xml:space="preserve"> Actions ;</w:t>
+      </w:r>
+    </w:p>
+    <w:p>
+      <w:pPr>
+        <w:spacing w:after="0"/>
+        <w:rPr>
+          <w:rFonts w:ascii="Times New Roman" w:hAnsi="Times New Roman" w:cs="Times New Roman"/>
+          <w:sz w:val="24"/>
+          <w:szCs w:val="24"/>
+          <w:lang w:val="fr-FR"/>
+        </w:rPr>
+      </w:pPr>
+      <w:r>
+        <w:rPr>
+          <w:rFonts w:ascii="Times New Roman" w:hAnsi="Times New Roman" w:cs="Times New Roman"/>
+          <w:sz w:val="24"/>
+          <w:szCs w:val="24"/>
+          <w:lang w:val="fr-FR"/>
+        </w:rPr>
+        <w:t xml:space="preserve">- crée les dossiers </w:t>
+      </w:r>
+      <w:proofErr w:type="spellStart"/>
+      <w:r>
+        <w:rPr>
+          <w:rFonts w:ascii="Times New Roman" w:hAnsi="Times New Roman" w:cs="Times New Roman"/>
+          <w:sz w:val="24"/>
+          <w:szCs w:val="24"/>
+          <w:lang w:val="fr-FR"/>
+        </w:rPr>
+        <w:t>DevOps</w:t>
+      </w:r>
+      <w:proofErr w:type="spellEnd"/>
+      <w:r>
+        <w:rPr>
+          <w:rFonts w:ascii="Times New Roman" w:hAnsi="Times New Roman" w:cs="Times New Roman"/>
+          <w:sz w:val="24"/>
+          <w:szCs w:val="24"/>
+          <w:lang w:val="fr-FR"/>
+        </w:rPr>
+        <w:t xml:space="preserve"> manquants ;</w:t>
+      </w:r>
+    </w:p>
+    <w:p>
+      <w:pPr>
+        <w:spacing w:after="0"/>
+        <w:rPr>
+          <w:rFonts w:ascii="Times New Roman" w:hAnsi="Times New Roman" w:cs="Times New Roman"/>
+          <w:sz w:val="24"/>
+          <w:szCs w:val="24"/>
+          <w:lang w:val="fr-FR"/>
+        </w:rPr>
+      </w:pPr>
+      <w:r>
+        <w:rPr>
+          <w:rFonts w:ascii="Times New Roman" w:hAnsi="Times New Roman" w:cs="Times New Roman"/>
+          <w:sz w:val="24"/>
+          <w:szCs w:val="24"/>
+          <w:lang w:val="fr-FR"/>
+        </w:rPr>
+        <w:t>- crée des fichiers .</w:t>
+      </w:r>
+      <w:proofErr w:type="spellStart"/>
+      <w:r>
+        <w:rPr>
+          <w:rFonts w:ascii="Times New Roman" w:hAnsi="Times New Roman" w:cs="Times New Roman"/>
+          <w:sz w:val="24"/>
+          <w:szCs w:val="24"/>
+          <w:lang w:val="fr-FR"/>
+        </w:rPr>
+        <w:t>dockerignore</w:t>
+      </w:r>
+      <w:proofErr w:type="spellEnd"/>
+      <w:r>
+        <w:rPr>
+          <w:rFonts w:ascii="Times New Roman" w:hAnsi="Times New Roman" w:cs="Times New Roman"/>
+          <w:sz w:val="24"/>
+          <w:szCs w:val="24"/>
+          <w:lang w:val="fr-FR"/>
+        </w:rPr>
+        <w:t xml:space="preserve"> standards lorsqu'ils sont absents ;</w:t>
+      </w:r>
+    </w:p>
+    <w:p>
+      <w:pPr>
+        <w:spacing w:after="0"/>
+        <w:rPr>
+          <w:rFonts w:ascii="Times New Roman" w:hAnsi="Times New Roman" w:cs="Times New Roman"/>
+          <w:sz w:val="24"/>
+          <w:szCs w:val="24"/>
+          <w:lang w:val="fr-FR"/>
+        </w:rPr>
+      </w:pPr>
+      <w:r>
+        <w:rPr>
+          <w:rFonts w:ascii="Times New Roman" w:hAnsi="Times New Roman" w:cs="Times New Roman"/>
+          <w:sz w:val="24"/>
+          <w:szCs w:val="24"/>
+          <w:lang w:val="fr-FR"/>
+        </w:rPr>
+        <w:t>- génère un rapport de préparation ;</w:t>
+      </w:r>
+    </w:p>
+    <w:p>
+      <w:pPr>
+        <w:spacing w:after="0"/>
+        <w:rPr>
+          <w:rFonts w:ascii="Times New Roman" w:hAnsi="Times New Roman" w:cs="Times New Roman"/>
+          <w:sz w:val="24"/>
+          <w:szCs w:val="24"/>
+          <w:lang w:val="fr-FR"/>
+        </w:rPr>
+      </w:pPr>
+      <w:r>
+        <w:rPr>
+          <w:rFonts w:ascii="Times New Roman" w:hAnsi="Times New Roman" w:cs="Times New Roman"/>
+          <w:sz w:val="24"/>
+          <w:szCs w:val="24"/>
+          <w:lang w:val="fr-FR"/>
+        </w:rPr>
+        <w:t>- peut constituer un dossier "</w:t>
+      </w:r>
+      <w:proofErr w:type="spellStart"/>
+      <w:r>
+        <w:rPr>
+          <w:rFonts w:ascii="Times New Roman" w:hAnsi="Times New Roman" w:cs="Times New Roman"/>
+          <w:sz w:val="24"/>
+          <w:szCs w:val="24"/>
+          <w:lang w:val="fr-FR"/>
+        </w:rPr>
+        <w:t>devops_bundle</w:t>
+      </w:r>
+      <w:proofErr w:type="spellEnd"/>
+      <w:r>
+        <w:rPr>
+          <w:rFonts w:ascii="Times New Roman" w:hAnsi="Times New Roman" w:cs="Times New Roman"/>
+          <w:sz w:val="24"/>
+          <w:szCs w:val="24"/>
+          <w:lang w:val="fr-FR"/>
+        </w:rPr>
+        <w:t>" sans modifier les fichiers sources.</w:t>
+      </w:r>
+    </w:p>
+    <w:p>
+      <w:pPr>
+        <w:spacing w:after="0"/>
+        <w:rPr>
+          <w:rFonts w:ascii="Times New Roman" w:hAnsi="Times New Roman" w:cs="Times New Roman"/>
+          <w:sz w:val="24"/>
+          <w:szCs w:val="24"/>
+          <w:lang w:val="fr-FR"/>
+        </w:rPr>
+      </w:pPr>
+    </w:p>
+    <w:p>
+      <w:pPr>
+        <w:spacing w:after="0"/>
+        <w:rPr>
+          <w:rFonts w:ascii="Times New Roman" w:hAnsi="Times New Roman" w:cs="Times New Roman"/>
+          <w:sz w:val="24"/>
+          <w:szCs w:val="24"/>
+          <w:lang w:val="fr-FR"/>
+        </w:rPr>
+      </w:pPr>
+      <w:r>
+        <w:rPr>
+          <w:rFonts w:ascii="Times New Roman" w:hAnsi="Times New Roman" w:cs="Times New Roman"/>
+          <w:sz w:val="24"/>
+          <w:szCs w:val="24"/>
+          <w:lang w:val="fr-FR"/>
+        </w:rPr>
+        <w:t>Le script n'est pas exécuté automatiquement par Docker Compose.</w:t>
+      </w:r>
+    </w:p>
+    <w:p>
+      <w:pPr>
+        <w:spacing w:after="0"/>
+        <w:rPr>
+          <w:rFonts w:ascii="Times New Roman" w:hAnsi="Times New Roman" w:cs="Times New Roman"/>
+          <w:sz w:val="24"/>
+          <w:szCs w:val="24"/>
+          <w:lang w:val="fr-FR"/>
+        </w:rPr>
+      </w:pPr>
+      <w:r>
+        <w:rPr>
+          <w:rFonts w:ascii="Times New Roman" w:hAnsi="Times New Roman" w:cs="Times New Roman"/>
+          <w:sz w:val="24"/>
+          <w:szCs w:val="24"/>
+          <w:lang w:val="fr-FR"/>
+        </w:rPr>
+        <w:t>Il doit être lancé explicitement :</w:t>
+      </w:r>
+    </w:p>
+    <w:p>
+      <w:pPr>
+        <w:spacing w:after="0"/>
+        <w:rPr>
+          <w:rFonts w:ascii="Times New Roman" w:hAnsi="Times New Roman" w:cs="Times New Roman"/>
+          <w:sz w:val="24"/>
+          <w:szCs w:val="24"/>
+          <w:lang w:val="en-GB"/>
+        </w:rPr>
+      </w:pPr>
+      <w:r>
+        <w:rPr>
+          <w:rFonts w:ascii="Times New Roman" w:hAnsi="Times New Roman" w:cs="Times New Roman"/>
+          <w:sz w:val="24"/>
+          <w:szCs w:val="24"/>
+          <w:lang w:val="fr-FR"/>
+        </w:rPr>
+        <w:t xml:space="preserve">    </w:t>
+      </w:r>
+      <w:proofErr w:type="gramStart"/>
+      <w:r>
+        <w:rPr>
+          <w:rFonts w:ascii="Times New Roman" w:hAnsi="Times New Roman" w:cs="Times New Roman"/>
+          <w:sz w:val="24"/>
+          <w:szCs w:val="24"/>
+          <w:lang w:val="en-GB"/>
+        </w:rPr>
+        <w:t>python</w:t>
+      </w:r>
+      <w:proofErr w:type="gramEnd"/>
+      <w:r>
+        <w:rPr>
+          <w:rFonts w:ascii="Times New Roman" w:hAnsi="Times New Roman" w:cs="Times New Roman"/>
+          <w:sz w:val="24"/>
+          <w:szCs w:val="24"/>
+          <w:lang w:val="en-GB"/>
+        </w:rPr>
+        <w:t xml:space="preserve"> devops_files.py check</w:t>
+      </w:r>
+    </w:p>
+    <w:p>
+      <w:pPr>
+        <w:spacing w:after="0"/>
+        <w:rPr>
+          <w:rFonts w:ascii="Times New Roman" w:hAnsi="Times New Roman" w:cs="Times New Roman"/>
+          <w:sz w:val="24"/>
+          <w:szCs w:val="24"/>
+          <w:lang w:val="en-GB"/>
+        </w:rPr>
+      </w:pPr>
+      <w:r>
+        <w:rPr>
+          <w:rFonts w:ascii="Times New Roman" w:hAnsi="Times New Roman" w:cs="Times New Roman"/>
+          <w:sz w:val="24"/>
+          <w:szCs w:val="24"/>
+          <w:lang w:val="en-GB"/>
+        </w:rPr>
+        <w:t xml:space="preserve">    </w:t>
+      </w:r>
+      <w:proofErr w:type="gramStart"/>
+      <w:r>
+        <w:rPr>
+          <w:rFonts w:ascii="Times New Roman" w:hAnsi="Times New Roman" w:cs="Times New Roman"/>
+          <w:sz w:val="24"/>
+          <w:szCs w:val="24"/>
+          <w:lang w:val="en-GB"/>
+        </w:rPr>
+        <w:t>python</w:t>
+      </w:r>
+      <w:proofErr w:type="gramEnd"/>
+      <w:r>
+        <w:rPr>
+          <w:rFonts w:ascii="Times New Roman" w:hAnsi="Times New Roman" w:cs="Times New Roman"/>
+          <w:sz w:val="24"/>
+          <w:szCs w:val="24"/>
+          <w:lang w:val="en-GB"/>
+        </w:rPr>
+        <w:t xml:space="preserve"> devops_files.py prepare</w:t>
+      </w:r>
+    </w:p>
+    <w:p>
+      <w:pPr>
+        <w:spacing w:after="0"/>
+        <w:rPr>
+          <w:rFonts w:ascii="Times New Roman" w:hAnsi="Times New Roman" w:cs="Times New Roman"/>
+          <w:sz w:val="24"/>
+          <w:szCs w:val="24"/>
+          <w:lang w:val="fr-FR"/>
+        </w:rPr>
+      </w:pPr>
+      <w:r>
+        <w:rPr>
+          <w:rFonts w:ascii="Times New Roman" w:hAnsi="Times New Roman" w:cs="Times New Roman"/>
+          <w:sz w:val="24"/>
+          <w:szCs w:val="24"/>
+          <w:lang w:val="en-GB"/>
         </w:rPr>
         <w:t xml:space="preserve">    </w:t>
       </w:r>
@@ -18667,6 +18952,11 @@
       <w:lang w:val="fr-FR" w:eastAsia="fr-FR"/>
     </w:rPr>
   </w:style>
+  <w:style w:type="character" w:customStyle="1" w:styleId="n">
+    <w:name w:val="ͼn"/>
+    <w:basedOn w:val="Policepardfaut"/>
+    <w:rsid w:val="0055500D"/>
+  </w:style>
 </w:styles>
 </file>
 
@@ -29948,6 +30238,11 @@
       <w:szCs w:val="24"/>
       <w:lang w:val="fr-FR" w:eastAsia="fr-FR"/>
     </w:rPr>
+  </w:style>
+  <w:style w:type="character" w:customStyle="1" w:styleId="n">
+    <w:name w:val="ͼn"/>
+    <w:basedOn w:val="Policepardfaut"/>
+    <w:rsid w:val="0055500D"/>
   </w:style>
 </w:styles>
 </file>
@@ -30277,7 +30572,7 @@
 </file>
 
 <file path=customXml/itemProps1.xml><?xml version="1.0" encoding="utf-8"?>
-<ds:datastoreItem xmlns:ds="http://schemas.openxmlformats.org/officeDocument/2006/customXml" ds:itemID="{280DE924-0BD5-499F-A4D2-6B92CBA069C7}">
+<ds:datastoreItem xmlns:ds="http://schemas.openxmlformats.org/officeDocument/2006/customXml" ds:itemID="{882D22B9-5ACF-40F1-87D1-83AF1B8E304F}">
   <ds:schemaRefs>
     <ds:schemaRef ds:uri="http://schemas.openxmlformats.org/officeDocument/2006/bibliography"/>
   </ds:schemaRefs>

</xml_diff>

<commit_message>
correction de l'access au token par task-service lors de la création de tache
</commit_message>
<xml_diff>
--- a/video et fichiers à publier/Presentation_DevOps_TaskManager_Microservices_v2.docx
+++ b/video et fichiers à publier/Presentation_DevOps_TaskManager_Microservices_v2.docx
@@ -3637,6 +3637,7 @@
           <w:rFonts w:ascii="Times New Roman" w:hAnsi="Times New Roman" w:cs="Times New Roman"/>
           <w:sz w:val="24"/>
           <w:szCs w:val="24"/>
+          <w:lang w:val="fr-FR"/>
         </w:rPr>
       </w:pPr>
       <w:r>
@@ -3648,10 +3649,10 @@
           <w:lang w:val="fr-FR" w:eastAsia="fr-FR"/>
         </w:rPr>
         <w:drawing>
-          <wp:inline distT="0" distB="0" distL="0" distR="0" wp14:anchorId="0755609F" wp14:editId="7168624A">
-            <wp:extent cx="6623436" cy="834887"/>
-            <wp:effectExtent l="0" t="0" r="0" b="3810"/>
-            <wp:docPr id="2" name="Picture 2"/>
+          <wp:inline distT="0" distB="0" distL="0" distR="0">
+            <wp:extent cx="6851650" cy="1162050"/>
+            <wp:effectExtent l="0" t="0" r="6350" b="0"/>
+            <wp:docPr id="1" name="Image 1"/>
             <wp:cNvGraphicFramePr>
               <a:graphicFrameLocks xmlns:a="http://schemas.openxmlformats.org/drawingml/2006/main" noChangeAspect="1"/>
             </wp:cNvGraphicFramePr>
@@ -3659,23 +3660,36 @@
               <a:graphicData uri="http://schemas.openxmlformats.org/drawingml/2006/picture">
                 <pic:pic xmlns:pic="http://schemas.openxmlformats.org/drawingml/2006/picture">
                   <pic:nvPicPr>
-                    <pic:cNvPr id="0" name="cicd_pipeline.png"/>
-                    <pic:cNvPicPr/>
+                    <pic:cNvPr id="0" name="Picture 1"/>
+                    <pic:cNvPicPr>
+                      <a:picLocks noChangeAspect="1" noChangeArrowheads="1"/>
+                    </pic:cNvPicPr>
                   </pic:nvPicPr>
                   <pic:blipFill>
-                    <a:blip r:embed="rId8"/>
+                    <a:blip r:embed="rId8">
+                      <a:extLst>
+                        <a:ext uri="{28A0092B-C50C-407E-A947-70E740481C1C}">
+                          <a14:useLocalDpi xmlns:a14="http://schemas.microsoft.com/office/drawing/2010/main" val="0"/>
+                        </a:ext>
+                      </a:extLst>
+                    </a:blip>
+                    <a:srcRect/>
                     <a:stretch>
                       <a:fillRect/>
                     </a:stretch>
                   </pic:blipFill>
-                  <pic:spPr>
+                  <pic:spPr bwMode="auto">
                     <a:xfrm>
                       <a:off x="0" y="0"/>
-                      <a:ext cx="6619011" cy="834329"/>
+                      <a:ext cx="6851650" cy="1162050"/>
                     </a:xfrm>
                     <a:prstGeom prst="rect">
                       <a:avLst/>
                     </a:prstGeom>
+                    <a:noFill/>
+                    <a:ln>
+                      <a:noFill/>
+                    </a:ln>
                   </pic:spPr>
                 </pic:pic>
               </a:graphicData>
@@ -4152,6 +4166,7 @@
         <w:rPr>
           <w:lang w:val="fr-FR"/>
         </w:rPr>
+        <w:lastRenderedPageBreak/>
         <w:t>• k8s/*.</w:t>
       </w:r>
       <w:proofErr w:type="spellStart"/>
@@ -4274,7 +4289,6 @@
         <w:rPr>
           <w:lang w:val="fr-FR"/>
         </w:rPr>
-        <w:lastRenderedPageBreak/>
         <w:t>•</w:t>
       </w:r>
       <w:r>
@@ -4918,6 +4932,7 @@
         <w:rPr>
           <w:lang w:val="fr-FR"/>
         </w:rPr>
+        <w:lastRenderedPageBreak/>
         <w:t>Arrêter et</w:t>
       </w:r>
       <w:r>
@@ -5061,23 +5076,23 @@
     </w:p>
     <w:p>
       <w:pPr>
-        <w:spacing w:after="0"/>
-        <w:rPr>
-          <w:rStyle w:val="l"/>
+        <w:autoSpaceDE w:val="0"/>
+        <w:autoSpaceDN w:val="0"/>
+        <w:adjustRightInd w:val="0"/>
+        <w:spacing w:after="0" w:line="240" w:lineRule="auto"/>
+        <w:rPr>
           <w:rFonts w:ascii="Times New Roman" w:hAnsi="Times New Roman" w:cs="Times New Roman"/>
           <w:color w:val="0070C0"/>
           <w:sz w:val="24"/>
           <w:szCs w:val="24"/>
+          <w:lang w:val="en-GB"/>
         </w:rPr>
       </w:pPr>
       <w:proofErr w:type="spellStart"/>
       <w:proofErr w:type="gramStart"/>
       <w:r>
         <w:rPr>
-          <w:rFonts w:ascii="Times New Roman" w:hAnsi="Times New Roman" w:cs="Times New Roman"/>
           <w:color w:val="0070C0"/>
-          <w:sz w:val="24"/>
-          <w:szCs w:val="24"/>
         </w:rPr>
         <w:t>docker</w:t>
       </w:r>
@@ -5085,21 +5100,15 @@
       <w:proofErr w:type="gramEnd"/>
       <w:r>
         <w:rPr>
-          <w:rFonts w:ascii="Times New Roman" w:hAnsi="Times New Roman" w:cs="Times New Roman"/>
           <w:color w:val="0070C0"/>
-          <w:sz w:val="24"/>
-          <w:szCs w:val="24"/>
-        </w:rPr>
-        <w:t xml:space="preserve"> </w:t>
+        </w:rPr>
+        <w:t xml:space="preserve"> compose </w:t>
       </w:r>
       <w:proofErr w:type="spellStart"/>
       <w:r>
         <w:rPr>
           <w:rStyle w:val="l"/>
-          <w:rFonts w:ascii="Times New Roman" w:hAnsi="Times New Roman" w:cs="Times New Roman"/>
           <w:color w:val="0070C0"/>
-          <w:sz w:val="24"/>
-          <w:szCs w:val="24"/>
         </w:rPr>
         <w:t>ps</w:t>
       </w:r>
@@ -5136,8 +5145,9 @@
           <w:sz w:val="24"/>
           <w:szCs w:val="24"/>
         </w:rPr>
-        <w:t xml:space="preserve"> compose </w:t>
-      </w:r>
+        <w:t xml:space="preserve"> </w:t>
+      </w:r>
+      <w:proofErr w:type="spellStart"/>
       <w:r>
         <w:rPr>
           <w:rStyle w:val="l"/>
@@ -5146,11 +5156,66 @@
           <w:sz w:val="24"/>
           <w:szCs w:val="24"/>
         </w:rPr>
-        <w:t>image</w:t>
-      </w:r>
+        <w:t>ps</w:t>
+      </w:r>
+      <w:proofErr w:type="spellEnd"/>
     </w:p>
     <w:p>
       <w:pPr>
+        <w:spacing w:after="0"/>
+        <w:rPr>
+          <w:rStyle w:val="l"/>
+          <w:rFonts w:ascii="Times New Roman" w:hAnsi="Times New Roman" w:cs="Times New Roman"/>
+          <w:color w:val="0070C0"/>
+          <w:sz w:val="24"/>
+          <w:szCs w:val="24"/>
+        </w:rPr>
+      </w:pPr>
+      <w:proofErr w:type="spellStart"/>
+      <w:proofErr w:type="gramStart"/>
+      <w:r>
+        <w:rPr>
+          <w:rFonts w:ascii="Times New Roman" w:hAnsi="Times New Roman" w:cs="Times New Roman"/>
+          <w:color w:val="0070C0"/>
+          <w:sz w:val="24"/>
+          <w:szCs w:val="24"/>
+        </w:rPr>
+        <w:t>docker</w:t>
+      </w:r>
+      <w:proofErr w:type="spellEnd"/>
+      <w:proofErr w:type="gramEnd"/>
+      <w:r>
+        <w:rPr>
+          <w:rFonts w:ascii="Times New Roman" w:hAnsi="Times New Roman" w:cs="Times New Roman"/>
+          <w:color w:val="0070C0"/>
+          <w:sz w:val="24"/>
+          <w:szCs w:val="24"/>
+        </w:rPr>
+        <w:t xml:space="preserve"> compose </w:t>
+      </w:r>
+      <w:r>
+        <w:rPr>
+          <w:rStyle w:val="l"/>
+          <w:rFonts w:ascii="Times New Roman" w:hAnsi="Times New Roman" w:cs="Times New Roman"/>
+          <w:color w:val="0070C0"/>
+          <w:sz w:val="24"/>
+          <w:szCs w:val="24"/>
+        </w:rPr>
+        <w:t>image</w:t>
+      </w:r>
+      <w:r>
+        <w:rPr>
+          <w:rStyle w:val="l"/>
+          <w:rFonts w:ascii="Times New Roman" w:hAnsi="Times New Roman" w:cs="Times New Roman"/>
+          <w:color w:val="0070C0"/>
+          <w:sz w:val="24"/>
+          <w:szCs w:val="24"/>
+        </w:rPr>
+        <w:t>s</w:t>
+      </w:r>
+    </w:p>
+    <w:p>
+      <w:pPr>
         <w:spacing w:after="0" w:line="240" w:lineRule="auto"/>
         <w:rPr>
           <w:rFonts w:ascii="Times New Roman" w:eastAsia="Times New Roman" w:hAnsi="Times New Roman" w:cs="Times New Roman"/>
@@ -5166,11 +5231,8 @@
           <w:szCs w:val="24"/>
           <w:lang w:val="fr-FR" w:eastAsia="fr-FR"/>
         </w:rPr>
-        <w:lastRenderedPageBreak/>
         <w:t>Si vous voulez supprimer tous les conteneurs existants d’un coup :</w:t>
       </w:r>
-      <w:bookmarkStart w:id="0" w:name="_GoBack"/>
-      <w:bookmarkEnd w:id="0"/>
     </w:p>
     <w:p>
       <w:pPr>
@@ -5322,78 +5384,283 @@
           <w:rFonts w:ascii="Times New Roman" w:hAnsi="Times New Roman" w:cs="Times New Roman"/>
           <w:sz w:val="24"/>
           <w:szCs w:val="24"/>
-          <w:lang w:val="en-GB"/>
-        </w:rPr>
-      </w:pPr>
+          <w:lang w:val="fr-FR"/>
+        </w:rPr>
+      </w:pPr>
+      <w:r>
+        <w:rPr>
+          <w:rStyle w:val="l"/>
+          <w:rFonts w:ascii="Times New Roman" w:hAnsi="Times New Roman" w:cs="Times New Roman"/>
+          <w:sz w:val="24"/>
+          <w:szCs w:val="24"/>
+          <w:lang w:val="fr-FR"/>
+        </w:rPr>
+        <w:t>Puis contrôlez :</w:t>
+      </w:r>
+    </w:p>
+    <w:p>
+      <w:pPr>
+        <w:spacing w:after="0"/>
+        <w:rPr>
+          <w:rStyle w:val="l"/>
+          <w:rFonts w:ascii="Times New Roman" w:hAnsi="Times New Roman" w:cs="Times New Roman"/>
+          <w:color w:val="0070C0"/>
+          <w:sz w:val="24"/>
+          <w:szCs w:val="24"/>
+          <w:lang w:val="fr-FR"/>
+        </w:rPr>
+      </w:pPr>
+      <w:proofErr w:type="gramStart"/>
+      <w:r>
+        <w:rPr>
+          <w:rStyle w:val="l"/>
+          <w:rFonts w:ascii="Times New Roman" w:hAnsi="Times New Roman" w:cs="Times New Roman"/>
+          <w:color w:val="0070C0"/>
+          <w:sz w:val="24"/>
+          <w:szCs w:val="24"/>
+          <w:lang w:val="fr-FR"/>
+        </w:rPr>
+        <w:t>docker</w:t>
+      </w:r>
+      <w:proofErr w:type="gramEnd"/>
+      <w:r>
+        <w:rPr>
+          <w:rStyle w:val="l"/>
+          <w:rFonts w:ascii="Times New Roman" w:hAnsi="Times New Roman" w:cs="Times New Roman"/>
+          <w:color w:val="0070C0"/>
+          <w:sz w:val="24"/>
+          <w:szCs w:val="24"/>
+          <w:lang w:val="fr-FR"/>
+        </w:rPr>
+        <w:t xml:space="preserve"> </w:t>
+      </w:r>
       <w:proofErr w:type="spellStart"/>
       <w:r>
         <w:rPr>
           <w:rStyle w:val="l"/>
           <w:rFonts w:ascii="Times New Roman" w:hAnsi="Times New Roman" w:cs="Times New Roman"/>
-          <w:sz w:val="24"/>
-          <w:szCs w:val="24"/>
-          <w:lang w:val="en-GB"/>
-        </w:rPr>
-        <w:t>Puis</w:t>
+          <w:color w:val="0070C0"/>
+          <w:sz w:val="24"/>
+          <w:szCs w:val="24"/>
+          <w:lang w:val="fr-FR"/>
+        </w:rPr>
+        <w:t>ps</w:t>
       </w:r>
       <w:proofErr w:type="spellEnd"/>
       <w:r>
         <w:rPr>
           <w:rStyle w:val="l"/>
           <w:rFonts w:ascii="Times New Roman" w:hAnsi="Times New Roman" w:cs="Times New Roman"/>
-          <w:sz w:val="24"/>
-          <w:szCs w:val="24"/>
-          <w:lang w:val="en-GB"/>
-        </w:rPr>
-        <w:t xml:space="preserve"> </w:t>
-      </w:r>
+          <w:color w:val="0070C0"/>
+          <w:sz w:val="24"/>
+          <w:szCs w:val="24"/>
+          <w:lang w:val="fr-FR"/>
+        </w:rPr>
+        <w:t xml:space="preserve"> -a</w:t>
+      </w:r>
+    </w:p>
+    <w:p>
+      <w:pPr>
+        <w:spacing w:after="0"/>
+        <w:rPr>
+          <w:rStyle w:val="l"/>
+          <w:rFonts w:ascii="Times New Roman" w:hAnsi="Times New Roman" w:cs="Times New Roman"/>
+          <w:sz w:val="24"/>
+          <w:szCs w:val="24"/>
+          <w:lang w:val="fr-FR"/>
+        </w:rPr>
+      </w:pPr>
+      <w:r>
+        <w:rPr>
+          <w:rStyle w:val="l"/>
+          <w:rFonts w:ascii="Times New Roman" w:hAnsi="Times New Roman" w:cs="Times New Roman"/>
+          <w:sz w:val="24"/>
+          <w:szCs w:val="24"/>
+          <w:lang w:val="fr-FR"/>
+        </w:rPr>
+        <w:t>//</w:t>
+      </w:r>
+    </w:p>
+    <w:p>
+      <w:pPr>
+        <w:spacing w:after="0"/>
+        <w:rPr>
+          <w:rFonts w:ascii="Times New Roman" w:hAnsi="Times New Roman" w:cs="Times New Roman"/>
+          <w:sz w:val="24"/>
+          <w:szCs w:val="24"/>
+          <w:lang w:val="fr-FR"/>
+        </w:rPr>
+      </w:pPr>
+      <w:r>
+        <w:rPr>
+          <w:rFonts w:ascii="Times New Roman" w:hAnsi="Times New Roman" w:cs="Times New Roman"/>
+          <w:sz w:val="24"/>
+          <w:szCs w:val="24"/>
+          <w:lang w:val="fr-FR"/>
+        </w:rPr>
+        <w:t xml:space="preserve">Lancer les conteneurs, après le </w:t>
+      </w:r>
+      <w:proofErr w:type="spellStart"/>
+      <w:r>
+        <w:rPr>
+          <w:rFonts w:ascii="Times New Roman" w:hAnsi="Times New Roman" w:cs="Times New Roman"/>
+          <w:sz w:val="24"/>
+          <w:szCs w:val="24"/>
+          <w:lang w:val="fr-FR"/>
+        </w:rPr>
+        <w:t>build</w:t>
+      </w:r>
+      <w:proofErr w:type="spellEnd"/>
+      <w:r>
+        <w:rPr>
+          <w:rFonts w:ascii="Times New Roman" w:hAnsi="Times New Roman" w:cs="Times New Roman"/>
+          <w:sz w:val="24"/>
+          <w:szCs w:val="24"/>
+          <w:lang w:val="fr-FR"/>
+        </w:rPr>
+        <w:t>, il faut exécuter :</w:t>
+      </w:r>
+    </w:p>
+    <w:p>
+      <w:pPr>
+        <w:spacing w:after="0"/>
+        <w:rPr>
+          <w:rFonts w:ascii="Times New Roman" w:hAnsi="Times New Roman" w:cs="Times New Roman"/>
+          <w:sz w:val="24"/>
+          <w:szCs w:val="24"/>
+          <w:lang w:val="fr-FR"/>
+        </w:rPr>
+      </w:pPr>
+    </w:p>
+    <w:p>
+      <w:pPr>
+        <w:spacing w:after="0"/>
+        <w:rPr>
+          <w:rFonts w:ascii="Times New Roman" w:hAnsi="Times New Roman" w:cs="Times New Roman"/>
+          <w:sz w:val="24"/>
+          <w:szCs w:val="24"/>
+          <w:lang w:val="fr-FR"/>
+        </w:rPr>
+      </w:pPr>
+      <w:proofErr w:type="gramStart"/>
+      <w:r>
+        <w:rPr>
+          <w:rFonts w:ascii="Times New Roman" w:hAnsi="Times New Roman" w:cs="Times New Roman"/>
+          <w:sz w:val="24"/>
+          <w:szCs w:val="24"/>
+          <w:lang w:val="fr-FR"/>
+        </w:rPr>
+        <w:t>docker</w:t>
+      </w:r>
+      <w:proofErr w:type="gramEnd"/>
+      <w:r>
+        <w:rPr>
+          <w:rFonts w:ascii="Times New Roman" w:hAnsi="Times New Roman" w:cs="Times New Roman"/>
+          <w:sz w:val="24"/>
+          <w:szCs w:val="24"/>
+          <w:lang w:val="fr-FR"/>
+        </w:rPr>
+        <w:t xml:space="preserve"> compose up</w:t>
+      </w:r>
+    </w:p>
+    <w:p>
+      <w:pPr>
+        <w:spacing w:after="0"/>
+        <w:rPr>
+          <w:rFonts w:ascii="Times New Roman" w:hAnsi="Times New Roman" w:cs="Times New Roman"/>
+          <w:sz w:val="24"/>
+          <w:szCs w:val="24"/>
+          <w:lang w:val="fr-FR"/>
+        </w:rPr>
+      </w:pPr>
+    </w:p>
+    <w:p>
+      <w:pPr>
+        <w:spacing w:after="0"/>
+        <w:rPr>
+          <w:rFonts w:ascii="Times New Roman" w:hAnsi="Times New Roman" w:cs="Times New Roman"/>
+          <w:sz w:val="24"/>
+          <w:szCs w:val="24"/>
+          <w:lang w:val="fr-FR"/>
+        </w:rPr>
+      </w:pPr>
+    </w:p>
+    <w:p>
+      <w:pPr>
+        <w:spacing w:after="0"/>
+        <w:rPr>
+          <w:rFonts w:ascii="Times New Roman" w:hAnsi="Times New Roman" w:cs="Times New Roman"/>
+          <w:sz w:val="24"/>
+          <w:szCs w:val="24"/>
+          <w:lang w:val="fr-FR"/>
+        </w:rPr>
+      </w:pPr>
+      <w:r>
+        <w:rPr>
+          <w:rFonts w:ascii="Times New Roman" w:hAnsi="Times New Roman" w:cs="Times New Roman"/>
+          <w:sz w:val="24"/>
+          <w:szCs w:val="24"/>
+          <w:lang w:val="fr-FR"/>
+        </w:rPr>
+        <w:t>///////////////////////// //</w:t>
+      </w:r>
+    </w:p>
+    <w:p>
+      <w:pPr>
+        <w:spacing w:after="0"/>
+        <w:rPr>
+          <w:i/>
+          <w:color w:val="0070C0"/>
+        </w:rPr>
+      </w:pPr>
       <w:proofErr w:type="spellStart"/>
       <w:proofErr w:type="gramStart"/>
       <w:r>
         <w:rPr>
-          <w:rStyle w:val="l"/>
-          <w:rFonts w:ascii="Times New Roman" w:hAnsi="Times New Roman" w:cs="Times New Roman"/>
-          <w:sz w:val="24"/>
-          <w:szCs w:val="24"/>
-          <w:lang w:val="en-GB"/>
-        </w:rPr>
-        <w:t>contrôlez</w:t>
+          <w:i/>
+          <w:color w:val="0070C0"/>
+        </w:rPr>
+        <w:t>docker</w:t>
       </w:r>
       <w:proofErr w:type="spellEnd"/>
-      <w:r>
-        <w:rPr>
-          <w:rStyle w:val="l"/>
-          <w:rFonts w:ascii="Times New Roman" w:hAnsi="Times New Roman" w:cs="Times New Roman"/>
-          <w:sz w:val="24"/>
-          <w:szCs w:val="24"/>
-          <w:lang w:val="en-GB"/>
-        </w:rPr>
-        <w:t xml:space="preserve"> :</w:t>
-      </w:r>
       <w:proofErr w:type="gramEnd"/>
+      <w:r>
+        <w:rPr>
+          <w:i/>
+          <w:color w:val="0070C0"/>
+        </w:rPr>
+        <w:t xml:space="preserve"> compose down </w:t>
+      </w:r>
+      <w:r>
+        <w:rPr>
+          <w:rStyle w:val="n"/>
+          <w:i/>
+          <w:color w:val="0070C0"/>
+        </w:rPr>
+        <w:t>--remove-orphans</w:t>
+      </w:r>
+      <w:r>
+        <w:rPr>
+          <w:i/>
+          <w:color w:val="0070C0"/>
+        </w:rPr>
+        <w:t xml:space="preserve"> </w:t>
+      </w:r>
     </w:p>
     <w:p>
       <w:pPr>
         <w:spacing w:after="0"/>
         <w:rPr>
-          <w:rStyle w:val="l"/>
-          <w:rFonts w:ascii="Times New Roman" w:hAnsi="Times New Roman" w:cs="Times New Roman"/>
+          <w:i/>
           <w:color w:val="0070C0"/>
-          <w:sz w:val="24"/>
-          <w:szCs w:val="24"/>
-          <w:lang w:val="en-GB"/>
         </w:rPr>
       </w:pPr>
       <w:proofErr w:type="spellStart"/>
       <w:proofErr w:type="gramStart"/>
       <w:r>
         <w:rPr>
-          <w:rStyle w:val="l"/>
-          <w:rFonts w:ascii="Times New Roman" w:hAnsi="Times New Roman" w:cs="Times New Roman"/>
+          <w:i/>
           <w:color w:val="0070C0"/>
-          <w:sz w:val="24"/>
-          <w:szCs w:val="24"/>
-          <w:lang w:val="en-GB"/>
         </w:rPr>
         <w:t>docker</w:t>
       </w:r>
@@ -5401,61 +5668,95 @@
       <w:proofErr w:type="gramEnd"/>
       <w:r>
         <w:rPr>
-          <w:rStyle w:val="l"/>
-          <w:rFonts w:ascii="Times New Roman" w:hAnsi="Times New Roman" w:cs="Times New Roman"/>
+          <w:i/>
           <w:color w:val="0070C0"/>
-          <w:sz w:val="24"/>
-          <w:szCs w:val="24"/>
-          <w:lang w:val="en-GB"/>
-        </w:rPr>
-        <w:t xml:space="preserve"> </w:t>
+        </w:rPr>
+        <w:t xml:space="preserve"> compose build </w:t>
+      </w:r>
+      <w:r>
+        <w:rPr>
+          <w:rStyle w:val="n"/>
+          <w:i/>
+          <w:color w:val="0070C0"/>
+        </w:rPr>
+        <w:t>--no-cache</w:t>
+      </w:r>
+      <w:r>
+        <w:rPr>
+          <w:i/>
+          <w:color w:val="0070C0"/>
+        </w:rPr>
+        <w:t xml:space="preserve"> task-service </w:t>
       </w:r>
       <w:proofErr w:type="spellStart"/>
       <w:r>
         <w:rPr>
-          <w:rStyle w:val="l"/>
-          <w:rFonts w:ascii="Times New Roman" w:hAnsi="Times New Roman" w:cs="Times New Roman"/>
+          <w:i/>
           <w:color w:val="0070C0"/>
-          <w:sz w:val="24"/>
-          <w:szCs w:val="24"/>
-          <w:lang w:val="en-GB"/>
-        </w:rPr>
-        <w:t>ps</w:t>
+        </w:rPr>
+        <w:t>api</w:t>
       </w:r>
       <w:proofErr w:type="spellEnd"/>
       <w:r>
         <w:rPr>
-          <w:rStyle w:val="l"/>
-          <w:rFonts w:ascii="Times New Roman" w:hAnsi="Times New Roman" w:cs="Times New Roman"/>
+          <w:i/>
           <w:color w:val="0070C0"/>
-          <w:sz w:val="24"/>
-          <w:szCs w:val="24"/>
-          <w:lang w:val="en-GB"/>
-        </w:rPr>
-        <w:t xml:space="preserve"> -a</w:t>
+        </w:rPr>
+        <w:t xml:space="preserve">-gateway </w:t>
       </w:r>
     </w:p>
     <w:p>
       <w:pPr>
         <w:spacing w:after="0"/>
         <w:rPr>
-          <w:rStyle w:val="l"/>
-          <w:rFonts w:ascii="Times New Roman" w:hAnsi="Times New Roman" w:cs="Times New Roman"/>
-          <w:sz w:val="24"/>
-          <w:szCs w:val="24"/>
-          <w:lang w:val="fr-FR"/>
-        </w:rPr>
-      </w:pPr>
-      <w:r>
-        <w:rPr>
-          <w:rStyle w:val="l"/>
-          <w:rFonts w:ascii="Times New Roman" w:hAnsi="Times New Roman" w:cs="Times New Roman"/>
-          <w:sz w:val="24"/>
-          <w:szCs w:val="24"/>
-          <w:lang w:val="fr-FR"/>
-        </w:rPr>
-        <w:t>//</w:t>
-      </w:r>
+          <w:rStyle w:val="n"/>
+          <w:i/>
+          <w:color w:val="0070C0"/>
+        </w:rPr>
+      </w:pPr>
+      <w:proofErr w:type="spellStart"/>
+      <w:proofErr w:type="gramStart"/>
+      <w:r>
+        <w:rPr>
+          <w:i/>
+          <w:color w:val="0070C0"/>
+        </w:rPr>
+        <w:t>docker</w:t>
+      </w:r>
+      <w:proofErr w:type="spellEnd"/>
+      <w:proofErr w:type="gramEnd"/>
+      <w:r>
+        <w:rPr>
+          <w:i/>
+          <w:color w:val="0070C0"/>
+        </w:rPr>
+        <w:t xml:space="preserve"> compose up </w:t>
+      </w:r>
+      <w:r>
+        <w:rPr>
+          <w:rStyle w:val="n"/>
+          <w:i/>
+          <w:color w:val="0070C0"/>
+        </w:rPr>
+        <w:t>-d</w:t>
+      </w:r>
+      <w:r>
+        <w:rPr>
+          <w:i/>
+          <w:color w:val="0070C0"/>
+        </w:rPr>
+        <w:t xml:space="preserve"> </w:t>
+      </w:r>
+      <w:r>
+        <w:rPr>
+          <w:rStyle w:val="n"/>
+          <w:i/>
+          <w:color w:val="0070C0"/>
+        </w:rPr>
+        <w:t>--force-recreate</w:t>
+      </w:r>
+      <w:bookmarkStart w:id="0" w:name="_GoBack"/>
+      <w:bookmarkEnd w:id="0"/>
     </w:p>
     <w:p>
       <w:pPr>
@@ -5464,38 +5765,9 @@
           <w:rFonts w:ascii="Times New Roman" w:hAnsi="Times New Roman" w:cs="Times New Roman"/>
           <w:sz w:val="24"/>
           <w:szCs w:val="24"/>
-          <w:lang w:val="fr-FR"/>
-        </w:rPr>
-      </w:pPr>
-      <w:r>
-        <w:rPr>
-          <w:rFonts w:ascii="Times New Roman" w:hAnsi="Times New Roman" w:cs="Times New Roman"/>
-          <w:sz w:val="24"/>
-          <w:szCs w:val="24"/>
-          <w:lang w:val="fr-FR"/>
-        </w:rPr>
-        <w:t xml:space="preserve">Lancer les conteneurs, après le </w:t>
-      </w:r>
-      <w:proofErr w:type="spellStart"/>
-      <w:r>
-        <w:rPr>
-          <w:rFonts w:ascii="Times New Roman" w:hAnsi="Times New Roman" w:cs="Times New Roman"/>
-          <w:sz w:val="24"/>
-          <w:szCs w:val="24"/>
-          <w:lang w:val="fr-FR"/>
-        </w:rPr>
-        <w:t>build</w:t>
-      </w:r>
-      <w:proofErr w:type="spellEnd"/>
-      <w:r>
-        <w:rPr>
-          <w:rFonts w:ascii="Times New Roman" w:hAnsi="Times New Roman" w:cs="Times New Roman"/>
-          <w:sz w:val="24"/>
-          <w:szCs w:val="24"/>
-          <w:lang w:val="fr-FR"/>
-        </w:rPr>
-        <w:t>, il faut exécuter :</w:t>
-      </w:r>
+          <w:lang w:val="en-GB"/>
+        </w:rPr>
+      </w:pPr>
     </w:p>
     <w:p>
       <w:pPr>
@@ -5507,6 +5779,15 @@
           <w:lang w:val="fr-FR"/>
         </w:rPr>
       </w:pPr>
+      <w:r>
+        <w:rPr>
+          <w:rFonts w:ascii="Times New Roman" w:hAnsi="Times New Roman" w:cs="Times New Roman"/>
+          <w:sz w:val="24"/>
+          <w:szCs w:val="24"/>
+          <w:lang w:val="fr-FR"/>
+        </w:rPr>
+        <w:t>///////////////////////// //</w:t>
+      </w:r>
     </w:p>
     <w:p>
       <w:pPr>
@@ -5518,7 +5799,6 @@
           <w:lang w:val="fr-FR"/>
         </w:rPr>
       </w:pPr>
-      <w:proofErr w:type="gramStart"/>
       <w:r>
         <w:rPr>
           <w:rFonts w:ascii="Times New Roman" w:hAnsi="Times New Roman" w:cs="Times New Roman"/>
@@ -5526,17 +5806,7 @@
           <w:szCs w:val="24"/>
           <w:lang w:val="fr-FR"/>
         </w:rPr>
-        <w:t>docker</w:t>
-      </w:r>
-      <w:proofErr w:type="gramEnd"/>
-      <w:r>
-        <w:rPr>
-          <w:rFonts w:ascii="Times New Roman" w:hAnsi="Times New Roman" w:cs="Times New Roman"/>
-          <w:sz w:val="24"/>
-          <w:szCs w:val="24"/>
-          <w:lang w:val="fr-FR"/>
-        </w:rPr>
-        <w:t xml:space="preserve"> compose up</w:t>
+        <w:t>///////////////////////// //</w:t>
       </w:r>
     </w:p>
     <w:p>
@@ -5552,38 +5822,8 @@
     </w:p>
     <w:p>
       <w:pPr>
-        <w:spacing w:after="0"/>
-        <w:rPr>
-          <w:rFonts w:ascii="Times New Roman" w:hAnsi="Times New Roman" w:cs="Times New Roman"/>
-          <w:sz w:val="24"/>
-          <w:szCs w:val="24"/>
-          <w:lang w:val="fr-FR"/>
-        </w:rPr>
-      </w:pPr>
-    </w:p>
-    <w:p>
-      <w:pPr>
-        <w:spacing w:after="0"/>
-        <w:rPr>
-          <w:rFonts w:ascii="Times New Roman" w:hAnsi="Times New Roman" w:cs="Times New Roman"/>
-          <w:sz w:val="24"/>
-          <w:szCs w:val="24"/>
-          <w:lang w:val="fr-FR"/>
-        </w:rPr>
-      </w:pPr>
-      <w:r>
-        <w:rPr>
-          <w:rFonts w:ascii="Times New Roman" w:hAnsi="Times New Roman" w:cs="Times New Roman"/>
-          <w:sz w:val="24"/>
-          <w:szCs w:val="24"/>
-          <w:lang w:val="fr-FR"/>
-        </w:rPr>
-        <w:t>///////////////////////// //</w:t>
-      </w:r>
-    </w:p>
-    <w:p>
-      <w:pPr>
         <w:pStyle w:val="pdq2pgselectionanchorcontainer"/>
+        <w:spacing w:before="0" w:beforeAutospacing="0" w:after="0" w:afterAutospacing="0"/>
         <w:rPr>
           <w:b/>
         </w:rPr>
@@ -30572,7 +30812,7 @@
 </file>
 
 <file path=customXml/itemProps1.xml><?xml version="1.0" encoding="utf-8"?>
-<ds:datastoreItem xmlns:ds="http://schemas.openxmlformats.org/officeDocument/2006/customXml" ds:itemID="{882D22B9-5ACF-40F1-87D1-83AF1B8E304F}">
+<ds:datastoreItem xmlns:ds="http://schemas.openxmlformats.org/officeDocument/2006/customXml" ds:itemID="{F7B31A93-2F2B-45E1-82B0-A402E5F67FB7}">
   <ds:schemaRefs>
     <ds:schemaRef ds:uri="http://schemas.openxmlformats.org/officeDocument/2006/bibliography"/>
   </ds:schemaRefs>

</xml_diff>